<commit_message>
Fix integration tests and correct parking fee calculation logic
</commit_message>
<xml_diff>
--- a/report.docx
+++ b/report.docx
@@ -794,17 +794,18 @@
           </w:tcPr>
           <w:p>
             <w:pPr>
-              <w:rPr>
-                <w:rFonts w:ascii="Lora" w:hAnsi="Lora"/>
-                <w:sz w:val="18"/>
-                <w:szCs w:val="18"/>
-              </w:rPr>
-            </w:pPr>
-            <w:r>
-              <w:rPr>
-                <w:rFonts w:ascii="Lora" w:hAnsi="Lora"/>
-                <w:sz w:val="18"/>
-                <w:szCs w:val="18"/>
+              <w:spacing w:line="276" w:lineRule="auto"/>
+              <w:rPr>
+                <w:rFonts w:ascii="Lora" w:hAnsi="Lora"/>
+                <w:sz w:val="16"/>
+                <w:szCs w:val="16"/>
+              </w:rPr>
+            </w:pPr>
+            <w:r>
+              <w:rPr>
+                <w:rFonts w:ascii="Lora" w:hAnsi="Lora"/>
+                <w:sz w:val="16"/>
+                <w:szCs w:val="16"/>
               </w:rPr>
               <w:t>Grace period 31 min</w:t>
             </w:r>
@@ -817,17 +818,18 @@
           </w:tcPr>
           <w:p>
             <w:pPr>
-              <w:rPr>
-                <w:rFonts w:ascii="Lora" w:hAnsi="Lora"/>
-                <w:sz w:val="18"/>
-                <w:szCs w:val="18"/>
-              </w:rPr>
-            </w:pPr>
-            <w:r>
-              <w:rPr>
-                <w:rFonts w:ascii="Lora" w:hAnsi="Lora"/>
-                <w:sz w:val="18"/>
-                <w:szCs w:val="18"/>
+              <w:spacing w:line="276" w:lineRule="auto"/>
+              <w:rPr>
+                <w:rFonts w:ascii="Lora" w:hAnsi="Lora"/>
+                <w:sz w:val="16"/>
+                <w:szCs w:val="16"/>
+              </w:rPr>
+            </w:pPr>
+            <w:r>
+              <w:rPr>
+                <w:rFonts w:ascii="Lora" w:hAnsi="Lora"/>
+                <w:sz w:val="16"/>
+                <w:szCs w:val="16"/>
               </w:rPr>
               <w:t>Car</w:t>
             </w:r>
@@ -840,17 +842,18 @@
           </w:tcPr>
           <w:p>
             <w:pPr>
-              <w:rPr>
-                <w:rFonts w:ascii="Lora" w:hAnsi="Lora"/>
-                <w:sz w:val="18"/>
-                <w:szCs w:val="18"/>
-              </w:rPr>
-            </w:pPr>
-            <w:r>
-              <w:rPr>
-                <w:rFonts w:ascii="Lora" w:hAnsi="Lora"/>
-                <w:sz w:val="18"/>
-                <w:szCs w:val="18"/>
+              <w:spacing w:line="276" w:lineRule="auto"/>
+              <w:rPr>
+                <w:rFonts w:ascii="Lora" w:hAnsi="Lora"/>
+                <w:sz w:val="16"/>
+                <w:szCs w:val="16"/>
+              </w:rPr>
+            </w:pPr>
+            <w:r>
+              <w:rPr>
+                <w:rFonts w:ascii="Lora" w:hAnsi="Lora"/>
+                <w:sz w:val="16"/>
+                <w:szCs w:val="16"/>
               </w:rPr>
               <w:t>31min</w:t>
             </w:r>
@@ -863,17 +866,18 @@
           </w:tcPr>
           <w:p>
             <w:pPr>
-              <w:rPr>
-                <w:rFonts w:ascii="Lora" w:hAnsi="Lora"/>
-                <w:sz w:val="18"/>
-                <w:szCs w:val="18"/>
-              </w:rPr>
-            </w:pPr>
-            <w:r>
-              <w:rPr>
-                <w:rFonts w:ascii="Lora" w:hAnsi="Lora"/>
-                <w:sz w:val="18"/>
-                <w:szCs w:val="18"/>
+              <w:spacing w:line="276" w:lineRule="auto"/>
+              <w:rPr>
+                <w:rFonts w:ascii="Lora" w:hAnsi="Lora"/>
+                <w:sz w:val="16"/>
+                <w:szCs w:val="16"/>
+              </w:rPr>
+            </w:pPr>
+            <w:r>
+              <w:rPr>
+                <w:rFonts w:ascii="Lora" w:hAnsi="Lora"/>
+                <w:sz w:val="16"/>
+                <w:szCs w:val="16"/>
               </w:rPr>
               <w:t>Guest</w:t>
             </w:r>
@@ -886,17 +890,18 @@
           </w:tcPr>
           <w:p>
             <w:pPr>
-              <w:rPr>
-                <w:rFonts w:ascii="Lora" w:hAnsi="Lora"/>
-                <w:sz w:val="18"/>
-                <w:szCs w:val="18"/>
-              </w:rPr>
-            </w:pPr>
-            <w:r>
-              <w:rPr>
-                <w:rFonts w:ascii="Lora" w:hAnsi="Lora"/>
-                <w:sz w:val="18"/>
-                <w:szCs w:val="18"/>
+              <w:spacing w:line="276" w:lineRule="auto"/>
+              <w:rPr>
+                <w:rFonts w:ascii="Lora" w:hAnsi="Lora"/>
+                <w:sz w:val="16"/>
+                <w:szCs w:val="16"/>
+              </w:rPr>
+            </w:pPr>
+            <w:r>
+              <w:rPr>
+                <w:rFonts w:ascii="Lora" w:hAnsi="Lora"/>
+                <w:sz w:val="16"/>
+                <w:szCs w:val="16"/>
               </w:rPr>
               <w:t>Guest</w:t>
             </w:r>
@@ -909,17 +914,18 @@
           </w:tcPr>
           <w:p>
             <w:pPr>
-              <w:rPr>
-                <w:rFonts w:ascii="Lora" w:hAnsi="Lora"/>
-                <w:sz w:val="18"/>
-                <w:szCs w:val="18"/>
-              </w:rPr>
-            </w:pPr>
-            <w:r>
-              <w:rPr>
-                <w:rFonts w:ascii="Lora" w:hAnsi="Lora"/>
-                <w:sz w:val="18"/>
-                <w:szCs w:val="18"/>
+              <w:spacing w:line="276" w:lineRule="auto"/>
+              <w:rPr>
+                <w:rFonts w:ascii="Lora" w:hAnsi="Lora"/>
+                <w:sz w:val="16"/>
+                <w:szCs w:val="16"/>
+              </w:rPr>
+            </w:pPr>
+            <w:r>
+              <w:rPr>
+                <w:rFonts w:ascii="Lora" w:hAnsi="Lora"/>
+                <w:sz w:val="16"/>
+                <w:szCs w:val="16"/>
               </w:rPr>
               <w:t>1000</w:t>
             </w:r>
@@ -981,17 +987,18 @@
           </w:tcPr>
           <w:p>
             <w:pPr>
-              <w:rPr>
-                <w:rFonts w:ascii="Lora" w:hAnsi="Lora"/>
-                <w:sz w:val="18"/>
-                <w:szCs w:val="18"/>
-              </w:rPr>
-            </w:pPr>
-            <w:r>
-              <w:rPr>
-                <w:rFonts w:ascii="Lora" w:hAnsi="Lora"/>
-                <w:sz w:val="18"/>
-                <w:szCs w:val="18"/>
+              <w:spacing w:line="276" w:lineRule="auto"/>
+              <w:rPr>
+                <w:rFonts w:ascii="Lora" w:hAnsi="Lora"/>
+                <w:sz w:val="16"/>
+                <w:szCs w:val="16"/>
+              </w:rPr>
+            </w:pPr>
+            <w:r>
+              <w:rPr>
+                <w:rFonts w:ascii="Lora" w:hAnsi="Lora"/>
+                <w:sz w:val="16"/>
+                <w:szCs w:val="16"/>
               </w:rPr>
               <w:t>Car 3 hours</w:t>
             </w:r>
@@ -1004,17 +1011,18 @@
           </w:tcPr>
           <w:p>
             <w:pPr>
-              <w:rPr>
-                <w:rFonts w:ascii="Lora" w:hAnsi="Lora"/>
-                <w:sz w:val="18"/>
-                <w:szCs w:val="18"/>
-              </w:rPr>
-            </w:pPr>
-            <w:r>
-              <w:rPr>
-                <w:rFonts w:ascii="Lora" w:hAnsi="Lora"/>
-                <w:sz w:val="18"/>
-                <w:szCs w:val="18"/>
+              <w:spacing w:line="276" w:lineRule="auto"/>
+              <w:rPr>
+                <w:rFonts w:ascii="Lora" w:hAnsi="Lora"/>
+                <w:sz w:val="16"/>
+                <w:szCs w:val="16"/>
+              </w:rPr>
+            </w:pPr>
+            <w:r>
+              <w:rPr>
+                <w:rFonts w:ascii="Lora" w:hAnsi="Lora"/>
+                <w:sz w:val="16"/>
+                <w:szCs w:val="16"/>
               </w:rPr>
               <w:t>Car</w:t>
             </w:r>
@@ -1027,17 +1035,18 @@
           </w:tcPr>
           <w:p>
             <w:pPr>
-              <w:rPr>
-                <w:rFonts w:ascii="Lora" w:hAnsi="Lora"/>
-                <w:sz w:val="18"/>
-                <w:szCs w:val="18"/>
-              </w:rPr>
-            </w:pPr>
-            <w:r>
-              <w:rPr>
-                <w:rFonts w:ascii="Lora" w:hAnsi="Lora"/>
-                <w:sz w:val="18"/>
-                <w:szCs w:val="18"/>
+              <w:spacing w:line="276" w:lineRule="auto"/>
+              <w:rPr>
+                <w:rFonts w:ascii="Lora" w:hAnsi="Lora"/>
+                <w:sz w:val="16"/>
+                <w:szCs w:val="16"/>
+              </w:rPr>
+            </w:pPr>
+            <w:r>
+              <w:rPr>
+                <w:rFonts w:ascii="Lora" w:hAnsi="Lora"/>
+                <w:sz w:val="16"/>
+                <w:szCs w:val="16"/>
               </w:rPr>
               <w:t>3h</w:t>
             </w:r>
@@ -1050,17 +1059,18 @@
           </w:tcPr>
           <w:p>
             <w:pPr>
-              <w:rPr>
-                <w:rFonts w:ascii="Lora" w:hAnsi="Lora"/>
-                <w:sz w:val="18"/>
-                <w:szCs w:val="18"/>
-              </w:rPr>
-            </w:pPr>
-            <w:r>
-              <w:rPr>
-                <w:rFonts w:ascii="Lora" w:hAnsi="Lora"/>
-                <w:sz w:val="18"/>
-                <w:szCs w:val="18"/>
+              <w:spacing w:line="276" w:lineRule="auto"/>
+              <w:rPr>
+                <w:rFonts w:ascii="Lora" w:hAnsi="Lora"/>
+                <w:sz w:val="16"/>
+                <w:szCs w:val="16"/>
+              </w:rPr>
+            </w:pPr>
+            <w:r>
+              <w:rPr>
+                <w:rFonts w:ascii="Lora" w:hAnsi="Lora"/>
+                <w:sz w:val="16"/>
+                <w:szCs w:val="16"/>
               </w:rPr>
               <w:t>Guest</w:t>
             </w:r>
@@ -1073,17 +1083,18 @@
           </w:tcPr>
           <w:p>
             <w:pPr>
-              <w:rPr>
-                <w:rFonts w:ascii="Lora" w:hAnsi="Lora"/>
-                <w:sz w:val="18"/>
-                <w:szCs w:val="18"/>
-              </w:rPr>
-            </w:pPr>
-            <w:r>
-              <w:rPr>
-                <w:rFonts w:ascii="Lora" w:hAnsi="Lora"/>
-                <w:sz w:val="18"/>
-                <w:szCs w:val="18"/>
+              <w:spacing w:line="276" w:lineRule="auto"/>
+              <w:rPr>
+                <w:rFonts w:ascii="Lora" w:hAnsi="Lora"/>
+                <w:sz w:val="16"/>
+                <w:szCs w:val="16"/>
+              </w:rPr>
+            </w:pPr>
+            <w:r>
+              <w:rPr>
+                <w:rFonts w:ascii="Lora" w:hAnsi="Lora"/>
+                <w:sz w:val="16"/>
+                <w:szCs w:val="16"/>
               </w:rPr>
               <w:t>Guest</w:t>
             </w:r>
@@ -1096,17 +1107,18 @@
           </w:tcPr>
           <w:p>
             <w:pPr>
-              <w:rPr>
-                <w:rFonts w:ascii="Lora" w:hAnsi="Lora"/>
-                <w:sz w:val="18"/>
-                <w:szCs w:val="18"/>
-              </w:rPr>
-            </w:pPr>
-            <w:r>
-              <w:rPr>
-                <w:rFonts w:ascii="Lora" w:hAnsi="Lora"/>
-                <w:sz w:val="18"/>
-                <w:szCs w:val="18"/>
+              <w:spacing w:line="276" w:lineRule="auto"/>
+              <w:rPr>
+                <w:rFonts w:ascii="Lora" w:hAnsi="Lora"/>
+                <w:sz w:val="16"/>
+                <w:szCs w:val="16"/>
+              </w:rPr>
+            </w:pPr>
+            <w:r>
+              <w:rPr>
+                <w:rFonts w:ascii="Lora" w:hAnsi="Lora"/>
+                <w:sz w:val="16"/>
+                <w:szCs w:val="16"/>
               </w:rPr>
               <w:t>3000</w:t>
             </w:r>
@@ -1168,17 +1180,18 @@
           </w:tcPr>
           <w:p>
             <w:pPr>
-              <w:rPr>
-                <w:rFonts w:ascii="Lora" w:hAnsi="Lora"/>
-                <w:sz w:val="18"/>
-                <w:szCs w:val="18"/>
-              </w:rPr>
-            </w:pPr>
-            <w:r>
-              <w:rPr>
-                <w:rFonts w:ascii="Lora" w:hAnsi="Lora"/>
-                <w:sz w:val="18"/>
-                <w:szCs w:val="18"/>
+              <w:spacing w:line="276" w:lineRule="auto"/>
+              <w:rPr>
+                <w:rFonts w:ascii="Lora" w:hAnsi="Lora"/>
+                <w:sz w:val="16"/>
+                <w:szCs w:val="16"/>
+              </w:rPr>
+            </w:pPr>
+            <w:r>
+              <w:rPr>
+                <w:rFonts w:ascii="Lora" w:hAnsi="Lora"/>
+                <w:sz w:val="16"/>
+                <w:szCs w:val="16"/>
               </w:rPr>
               <w:t>SUV 1 hour</w:t>
             </w:r>
@@ -1191,17 +1204,18 @@
           </w:tcPr>
           <w:p>
             <w:pPr>
-              <w:rPr>
-                <w:rFonts w:ascii="Lora" w:hAnsi="Lora"/>
-                <w:sz w:val="18"/>
-                <w:szCs w:val="18"/>
-              </w:rPr>
-            </w:pPr>
-            <w:r>
-              <w:rPr>
-                <w:rFonts w:ascii="Lora" w:hAnsi="Lora"/>
-                <w:sz w:val="18"/>
-                <w:szCs w:val="18"/>
+              <w:spacing w:line="276" w:lineRule="auto"/>
+              <w:rPr>
+                <w:rFonts w:ascii="Lora" w:hAnsi="Lora"/>
+                <w:sz w:val="16"/>
+                <w:szCs w:val="16"/>
+              </w:rPr>
+            </w:pPr>
+            <w:r>
+              <w:rPr>
+                <w:rFonts w:ascii="Lora" w:hAnsi="Lora"/>
+                <w:sz w:val="16"/>
+                <w:szCs w:val="16"/>
               </w:rPr>
               <w:t>SUV</w:t>
             </w:r>
@@ -1214,17 +1228,18 @@
           </w:tcPr>
           <w:p>
             <w:pPr>
-              <w:rPr>
-                <w:rFonts w:ascii="Lora" w:hAnsi="Lora"/>
-                <w:sz w:val="18"/>
-                <w:szCs w:val="18"/>
-              </w:rPr>
-            </w:pPr>
-            <w:r>
-              <w:rPr>
-                <w:rFonts w:ascii="Lora" w:hAnsi="Lora"/>
-                <w:sz w:val="18"/>
-                <w:szCs w:val="18"/>
+              <w:spacing w:line="276" w:lineRule="auto"/>
+              <w:rPr>
+                <w:rFonts w:ascii="Lora" w:hAnsi="Lora"/>
+                <w:sz w:val="16"/>
+                <w:szCs w:val="16"/>
+              </w:rPr>
+            </w:pPr>
+            <w:r>
+              <w:rPr>
+                <w:rFonts w:ascii="Lora" w:hAnsi="Lora"/>
+                <w:sz w:val="16"/>
+                <w:szCs w:val="16"/>
               </w:rPr>
               <w:t>1h</w:t>
             </w:r>
@@ -1237,17 +1252,18 @@
           </w:tcPr>
           <w:p>
             <w:pPr>
-              <w:rPr>
-                <w:rFonts w:ascii="Lora" w:hAnsi="Lora"/>
-                <w:sz w:val="18"/>
-                <w:szCs w:val="18"/>
-              </w:rPr>
-            </w:pPr>
-            <w:r>
-              <w:rPr>
-                <w:rFonts w:ascii="Lora" w:hAnsi="Lora"/>
-                <w:sz w:val="18"/>
-                <w:szCs w:val="18"/>
+              <w:spacing w:line="276" w:lineRule="auto"/>
+              <w:rPr>
+                <w:rFonts w:ascii="Lora" w:hAnsi="Lora"/>
+                <w:sz w:val="16"/>
+                <w:szCs w:val="16"/>
+              </w:rPr>
+            </w:pPr>
+            <w:r>
+              <w:rPr>
+                <w:rFonts w:ascii="Lora" w:hAnsi="Lora"/>
+                <w:sz w:val="16"/>
+                <w:szCs w:val="16"/>
               </w:rPr>
               <w:t>Guest</w:t>
             </w:r>
@@ -1260,17 +1276,18 @@
           </w:tcPr>
           <w:p>
             <w:pPr>
-              <w:rPr>
-                <w:rFonts w:ascii="Lora" w:hAnsi="Lora"/>
-                <w:sz w:val="18"/>
-                <w:szCs w:val="18"/>
-              </w:rPr>
-            </w:pPr>
-            <w:r>
-              <w:rPr>
-                <w:rFonts w:ascii="Lora" w:hAnsi="Lora"/>
-                <w:sz w:val="18"/>
-                <w:szCs w:val="18"/>
+              <w:spacing w:line="276" w:lineRule="auto"/>
+              <w:rPr>
+                <w:rFonts w:ascii="Lora" w:hAnsi="Lora"/>
+                <w:sz w:val="16"/>
+                <w:szCs w:val="16"/>
+              </w:rPr>
+            </w:pPr>
+            <w:r>
+              <w:rPr>
+                <w:rFonts w:ascii="Lora" w:hAnsi="Lora"/>
+                <w:sz w:val="16"/>
+                <w:szCs w:val="16"/>
               </w:rPr>
               <w:t>Guest</w:t>
             </w:r>
@@ -1283,17 +1300,18 @@
           </w:tcPr>
           <w:p>
             <w:pPr>
-              <w:rPr>
-                <w:rFonts w:ascii="Lora" w:hAnsi="Lora"/>
-                <w:sz w:val="18"/>
-                <w:szCs w:val="18"/>
-              </w:rPr>
-            </w:pPr>
-            <w:r>
-              <w:rPr>
-                <w:rFonts w:ascii="Lora" w:hAnsi="Lora"/>
-                <w:sz w:val="18"/>
-                <w:szCs w:val="18"/>
+              <w:spacing w:line="276" w:lineRule="auto"/>
+              <w:rPr>
+                <w:rFonts w:ascii="Lora" w:hAnsi="Lora"/>
+                <w:sz w:val="16"/>
+                <w:szCs w:val="16"/>
+              </w:rPr>
+            </w:pPr>
+            <w:r>
+              <w:rPr>
+                <w:rFonts w:ascii="Lora" w:hAnsi="Lora"/>
+                <w:sz w:val="16"/>
+                <w:szCs w:val="16"/>
               </w:rPr>
               <w:t>1500</w:t>
             </w:r>
@@ -1355,17 +1373,18 @@
           </w:tcPr>
           <w:p>
             <w:pPr>
-              <w:rPr>
-                <w:rFonts w:ascii="Lora" w:hAnsi="Lora"/>
-                <w:sz w:val="18"/>
-                <w:szCs w:val="18"/>
-              </w:rPr>
-            </w:pPr>
-            <w:r>
-              <w:rPr>
-                <w:rFonts w:ascii="Lora" w:hAnsi="Lora"/>
-                <w:sz w:val="18"/>
-                <w:szCs w:val="18"/>
+              <w:spacing w:line="276" w:lineRule="auto"/>
+              <w:rPr>
+                <w:rFonts w:ascii="Lora" w:hAnsi="Lora"/>
+                <w:sz w:val="16"/>
+                <w:szCs w:val="16"/>
+              </w:rPr>
+            </w:pPr>
+            <w:r>
+              <w:rPr>
+                <w:rFonts w:ascii="Lora" w:hAnsi="Lora"/>
+                <w:sz w:val="16"/>
+                <w:szCs w:val="16"/>
               </w:rPr>
               <w:t>Daily cap car</w:t>
             </w:r>
@@ -1378,17 +1397,18 @@
           </w:tcPr>
           <w:p>
             <w:pPr>
-              <w:rPr>
-                <w:rFonts w:ascii="Lora" w:hAnsi="Lora"/>
-                <w:sz w:val="18"/>
-                <w:szCs w:val="18"/>
-              </w:rPr>
-            </w:pPr>
-            <w:r>
-              <w:rPr>
-                <w:rFonts w:ascii="Lora" w:hAnsi="Lora"/>
-                <w:sz w:val="18"/>
-                <w:szCs w:val="18"/>
+              <w:spacing w:line="276" w:lineRule="auto"/>
+              <w:rPr>
+                <w:rFonts w:ascii="Lora" w:hAnsi="Lora"/>
+                <w:sz w:val="16"/>
+                <w:szCs w:val="16"/>
+              </w:rPr>
+            </w:pPr>
+            <w:r>
+              <w:rPr>
+                <w:rFonts w:ascii="Lora" w:hAnsi="Lora"/>
+                <w:sz w:val="16"/>
+                <w:szCs w:val="16"/>
               </w:rPr>
               <w:t>Car</w:t>
             </w:r>
@@ -1401,17 +1421,18 @@
           </w:tcPr>
           <w:p>
             <w:pPr>
-              <w:rPr>
-                <w:rFonts w:ascii="Lora" w:hAnsi="Lora"/>
-                <w:sz w:val="18"/>
-                <w:szCs w:val="18"/>
-              </w:rPr>
-            </w:pPr>
-            <w:r>
-              <w:rPr>
-                <w:rFonts w:ascii="Lora" w:hAnsi="Lora"/>
-                <w:sz w:val="18"/>
-                <w:szCs w:val="18"/>
+              <w:spacing w:line="276" w:lineRule="auto"/>
+              <w:rPr>
+                <w:rFonts w:ascii="Lora" w:hAnsi="Lora"/>
+                <w:sz w:val="16"/>
+                <w:szCs w:val="16"/>
+              </w:rPr>
+            </w:pPr>
+            <w:r>
+              <w:rPr>
+                <w:rFonts w:ascii="Lora" w:hAnsi="Lora"/>
+                <w:sz w:val="16"/>
+                <w:szCs w:val="16"/>
               </w:rPr>
               <w:t>12h</w:t>
             </w:r>
@@ -1424,17 +1445,18 @@
           </w:tcPr>
           <w:p>
             <w:pPr>
-              <w:rPr>
-                <w:rFonts w:ascii="Lora" w:hAnsi="Lora"/>
-                <w:sz w:val="18"/>
-                <w:szCs w:val="18"/>
-              </w:rPr>
-            </w:pPr>
-            <w:r>
-              <w:rPr>
-                <w:rFonts w:ascii="Lora" w:hAnsi="Lora"/>
-                <w:sz w:val="18"/>
-                <w:szCs w:val="18"/>
+              <w:spacing w:line="276" w:lineRule="auto"/>
+              <w:rPr>
+                <w:rFonts w:ascii="Lora" w:hAnsi="Lora"/>
+                <w:sz w:val="16"/>
+                <w:szCs w:val="16"/>
+              </w:rPr>
+            </w:pPr>
+            <w:r>
+              <w:rPr>
+                <w:rFonts w:ascii="Lora" w:hAnsi="Lora"/>
+                <w:sz w:val="16"/>
+                <w:szCs w:val="16"/>
               </w:rPr>
               <w:t>Guest</w:t>
             </w:r>
@@ -1447,17 +1469,18 @@
           </w:tcPr>
           <w:p>
             <w:pPr>
-              <w:rPr>
-                <w:rFonts w:ascii="Lora" w:hAnsi="Lora"/>
-                <w:sz w:val="18"/>
-                <w:szCs w:val="18"/>
-              </w:rPr>
-            </w:pPr>
-            <w:r>
-              <w:rPr>
-                <w:rFonts w:ascii="Lora" w:hAnsi="Lora"/>
-                <w:sz w:val="18"/>
-                <w:szCs w:val="18"/>
+              <w:spacing w:line="276" w:lineRule="auto"/>
+              <w:rPr>
+                <w:rFonts w:ascii="Lora" w:hAnsi="Lora"/>
+                <w:sz w:val="16"/>
+                <w:szCs w:val="16"/>
+              </w:rPr>
+            </w:pPr>
+            <w:r>
+              <w:rPr>
+                <w:rFonts w:ascii="Lora" w:hAnsi="Lora"/>
+                <w:sz w:val="16"/>
+                <w:szCs w:val="16"/>
               </w:rPr>
               <w:t>Guest</w:t>
             </w:r>
@@ -1470,17 +1493,18 @@
           </w:tcPr>
           <w:p>
             <w:pPr>
-              <w:rPr>
-                <w:rFonts w:ascii="Lora" w:hAnsi="Lora"/>
-                <w:sz w:val="18"/>
-                <w:szCs w:val="18"/>
-              </w:rPr>
-            </w:pPr>
-            <w:r>
-              <w:rPr>
-                <w:rFonts w:ascii="Lora" w:hAnsi="Lora"/>
-                <w:sz w:val="18"/>
-                <w:szCs w:val="18"/>
+              <w:spacing w:line="276" w:lineRule="auto"/>
+              <w:rPr>
+                <w:rFonts w:ascii="Lora" w:hAnsi="Lora"/>
+                <w:sz w:val="16"/>
+                <w:szCs w:val="16"/>
+              </w:rPr>
+            </w:pPr>
+            <w:r>
+              <w:rPr>
+                <w:rFonts w:ascii="Lora" w:hAnsi="Lora"/>
+                <w:sz w:val="16"/>
+                <w:szCs w:val="16"/>
               </w:rPr>
               <w:t>8000</w:t>
             </w:r>
@@ -1542,17 +1566,18 @@
           </w:tcPr>
           <w:p>
             <w:pPr>
-              <w:rPr>
-                <w:rFonts w:ascii="Lora" w:hAnsi="Lora"/>
-                <w:sz w:val="18"/>
-                <w:szCs w:val="18"/>
-              </w:rPr>
-            </w:pPr>
-            <w:r>
-              <w:rPr>
-                <w:rFonts w:ascii="Lora" w:hAnsi="Lora"/>
-                <w:sz w:val="18"/>
-                <w:szCs w:val="18"/>
+              <w:spacing w:line="276" w:lineRule="auto"/>
+              <w:rPr>
+                <w:rFonts w:ascii="Lora" w:hAnsi="Lora"/>
+                <w:sz w:val="16"/>
+                <w:szCs w:val="16"/>
+              </w:rPr>
+            </w:pPr>
+            <w:r>
+              <w:rPr>
+                <w:rFonts w:ascii="Lora" w:hAnsi="Lora"/>
+                <w:sz w:val="16"/>
+                <w:szCs w:val="16"/>
               </w:rPr>
               <w:t>Overnight fee</w:t>
             </w:r>
@@ -1565,17 +1590,18 @@
           </w:tcPr>
           <w:p>
             <w:pPr>
-              <w:rPr>
-                <w:rFonts w:ascii="Lora" w:hAnsi="Lora"/>
-                <w:sz w:val="18"/>
-                <w:szCs w:val="18"/>
-              </w:rPr>
-            </w:pPr>
-            <w:r>
-              <w:rPr>
-                <w:rFonts w:ascii="Lora" w:hAnsi="Lora"/>
-                <w:sz w:val="18"/>
-                <w:szCs w:val="18"/>
+              <w:spacing w:line="276" w:lineRule="auto"/>
+              <w:rPr>
+                <w:rFonts w:ascii="Lora" w:hAnsi="Lora"/>
+                <w:sz w:val="16"/>
+                <w:szCs w:val="16"/>
+              </w:rPr>
+            </w:pPr>
+            <w:r>
+              <w:rPr>
+                <w:rFonts w:ascii="Lora" w:hAnsi="Lora"/>
+                <w:sz w:val="16"/>
+                <w:szCs w:val="16"/>
               </w:rPr>
               <w:t>Car</w:t>
             </w:r>
@@ -1588,17 +1614,18 @@
           </w:tcPr>
           <w:p>
             <w:pPr>
-              <w:rPr>
-                <w:rFonts w:ascii="Lora" w:hAnsi="Lora"/>
-                <w:sz w:val="18"/>
-                <w:szCs w:val="18"/>
-              </w:rPr>
-            </w:pPr>
-            <w:r>
-              <w:rPr>
-                <w:rFonts w:ascii="Lora" w:hAnsi="Lora"/>
-                <w:sz w:val="18"/>
-                <w:szCs w:val="18"/>
+              <w:spacing w:line="276" w:lineRule="auto"/>
+              <w:rPr>
+                <w:rFonts w:ascii="Lora" w:hAnsi="Lora"/>
+                <w:sz w:val="16"/>
+                <w:szCs w:val="16"/>
+              </w:rPr>
+            </w:pPr>
+            <w:r>
+              <w:rPr>
+                <w:rFonts w:ascii="Lora" w:hAnsi="Lora"/>
+                <w:sz w:val="16"/>
+                <w:szCs w:val="16"/>
               </w:rPr>
               <w:t>8PM-11PM</w:t>
             </w:r>
@@ -1611,17 +1638,18 @@
           </w:tcPr>
           <w:p>
             <w:pPr>
-              <w:rPr>
-                <w:rFonts w:ascii="Lora" w:hAnsi="Lora"/>
-                <w:sz w:val="18"/>
-                <w:szCs w:val="18"/>
-              </w:rPr>
-            </w:pPr>
-            <w:r>
-              <w:rPr>
-                <w:rFonts w:ascii="Lora" w:hAnsi="Lora"/>
-                <w:sz w:val="18"/>
-                <w:szCs w:val="18"/>
+              <w:spacing w:line="276" w:lineRule="auto"/>
+              <w:rPr>
+                <w:rFonts w:ascii="Lora" w:hAnsi="Lora"/>
+                <w:sz w:val="16"/>
+                <w:szCs w:val="16"/>
+              </w:rPr>
+            </w:pPr>
+            <w:r>
+              <w:rPr>
+                <w:rFonts w:ascii="Lora" w:hAnsi="Lora"/>
+                <w:sz w:val="16"/>
+                <w:szCs w:val="16"/>
               </w:rPr>
               <w:t>Guest</w:t>
             </w:r>
@@ -1634,17 +1662,18 @@
           </w:tcPr>
           <w:p>
             <w:pPr>
-              <w:rPr>
-                <w:rFonts w:ascii="Lora" w:hAnsi="Lora"/>
-                <w:sz w:val="18"/>
-                <w:szCs w:val="18"/>
-              </w:rPr>
-            </w:pPr>
-            <w:r>
-              <w:rPr>
-                <w:rFonts w:ascii="Lora" w:hAnsi="Lora"/>
-                <w:sz w:val="18"/>
-                <w:szCs w:val="18"/>
+              <w:spacing w:line="276" w:lineRule="auto"/>
+              <w:rPr>
+                <w:rFonts w:ascii="Lora" w:hAnsi="Lora"/>
+                <w:sz w:val="16"/>
+                <w:szCs w:val="16"/>
+              </w:rPr>
+            </w:pPr>
+            <w:r>
+              <w:rPr>
+                <w:rFonts w:ascii="Lora" w:hAnsi="Lora"/>
+                <w:sz w:val="16"/>
+                <w:szCs w:val="16"/>
               </w:rPr>
               <w:t>Overnight</w:t>
             </w:r>
@@ -1657,17 +1686,18 @@
           </w:tcPr>
           <w:p>
             <w:pPr>
-              <w:rPr>
-                <w:rFonts w:ascii="Lora" w:hAnsi="Lora"/>
-                <w:sz w:val="18"/>
-                <w:szCs w:val="18"/>
-              </w:rPr>
-            </w:pPr>
-            <w:r>
-              <w:rPr>
-                <w:rFonts w:ascii="Lora" w:hAnsi="Lora"/>
-                <w:sz w:val="18"/>
-                <w:szCs w:val="18"/>
+              <w:spacing w:line="276" w:lineRule="auto"/>
+              <w:rPr>
+                <w:rFonts w:ascii="Lora" w:hAnsi="Lora"/>
+                <w:sz w:val="16"/>
+                <w:szCs w:val="16"/>
+              </w:rPr>
+            </w:pPr>
+            <w:r>
+              <w:rPr>
+                <w:rFonts w:ascii="Lora" w:hAnsi="Lora"/>
+                <w:sz w:val="16"/>
+                <w:szCs w:val="16"/>
               </w:rPr>
               <w:t>+2000</w:t>
             </w:r>
@@ -1729,17 +1759,18 @@
           </w:tcPr>
           <w:p>
             <w:pPr>
-              <w:rPr>
-                <w:rFonts w:ascii="Lora" w:hAnsi="Lora"/>
-                <w:sz w:val="18"/>
-                <w:szCs w:val="18"/>
-              </w:rPr>
-            </w:pPr>
-            <w:r>
-              <w:rPr>
-                <w:rFonts w:ascii="Lora" w:hAnsi="Lora"/>
-                <w:sz w:val="18"/>
-                <w:szCs w:val="18"/>
+              <w:spacing w:line="276" w:lineRule="auto"/>
+              <w:rPr>
+                <w:rFonts w:ascii="Lora" w:hAnsi="Lora"/>
+                <w:sz w:val="16"/>
+                <w:szCs w:val="16"/>
+              </w:rPr>
+            </w:pPr>
+            <w:r>
+              <w:rPr>
+                <w:rFonts w:ascii="Lora" w:hAnsi="Lora"/>
+                <w:sz w:val="16"/>
+                <w:szCs w:val="16"/>
               </w:rPr>
               <w:t>Weekend surcharge</w:t>
             </w:r>
@@ -1752,17 +1783,18 @@
           </w:tcPr>
           <w:p>
             <w:pPr>
-              <w:rPr>
-                <w:rFonts w:ascii="Lora" w:hAnsi="Lora"/>
-                <w:sz w:val="18"/>
-                <w:szCs w:val="18"/>
-              </w:rPr>
-            </w:pPr>
-            <w:r>
-              <w:rPr>
-                <w:rFonts w:ascii="Lora" w:hAnsi="Lora"/>
-                <w:sz w:val="18"/>
-                <w:szCs w:val="18"/>
+              <w:spacing w:line="276" w:lineRule="auto"/>
+              <w:rPr>
+                <w:rFonts w:ascii="Lora" w:hAnsi="Lora"/>
+                <w:sz w:val="16"/>
+                <w:szCs w:val="16"/>
+              </w:rPr>
+            </w:pPr>
+            <w:r>
+              <w:rPr>
+                <w:rFonts w:ascii="Lora" w:hAnsi="Lora"/>
+                <w:sz w:val="16"/>
+                <w:szCs w:val="16"/>
               </w:rPr>
               <w:t>Car</w:t>
             </w:r>
@@ -1775,17 +1807,18 @@
           </w:tcPr>
           <w:p>
             <w:pPr>
-              <w:rPr>
-                <w:rFonts w:ascii="Lora" w:hAnsi="Lora"/>
-                <w:sz w:val="18"/>
-                <w:szCs w:val="18"/>
-              </w:rPr>
-            </w:pPr>
-            <w:r>
-              <w:rPr>
-                <w:rFonts w:ascii="Lora" w:hAnsi="Lora"/>
-                <w:sz w:val="18"/>
-                <w:szCs w:val="18"/>
+              <w:spacing w:line="276" w:lineRule="auto"/>
+              <w:rPr>
+                <w:rFonts w:ascii="Lora" w:hAnsi="Lora"/>
+                <w:sz w:val="16"/>
+                <w:szCs w:val="16"/>
+              </w:rPr>
+            </w:pPr>
+            <w:r>
+              <w:rPr>
+                <w:rFonts w:ascii="Lora" w:hAnsi="Lora"/>
+                <w:sz w:val="16"/>
+                <w:szCs w:val="16"/>
               </w:rPr>
               <w:t>2h</w:t>
             </w:r>
@@ -1798,17 +1831,18 @@
           </w:tcPr>
           <w:p>
             <w:pPr>
-              <w:rPr>
-                <w:rFonts w:ascii="Lora" w:hAnsi="Lora"/>
-                <w:sz w:val="18"/>
-                <w:szCs w:val="18"/>
-              </w:rPr>
-            </w:pPr>
-            <w:r>
-              <w:rPr>
-                <w:rFonts w:ascii="Lora" w:hAnsi="Lora"/>
-                <w:sz w:val="18"/>
-                <w:szCs w:val="18"/>
+              <w:spacing w:line="276" w:lineRule="auto"/>
+              <w:rPr>
+                <w:rFonts w:ascii="Lora" w:hAnsi="Lora"/>
+                <w:sz w:val="16"/>
+                <w:szCs w:val="16"/>
+              </w:rPr>
+            </w:pPr>
+            <w:r>
+              <w:rPr>
+                <w:rFonts w:ascii="Lora" w:hAnsi="Lora"/>
+                <w:sz w:val="16"/>
+                <w:szCs w:val="16"/>
               </w:rPr>
               <w:t>Guest</w:t>
             </w:r>
@@ -1821,17 +1855,18 @@
           </w:tcPr>
           <w:p>
             <w:pPr>
-              <w:rPr>
-                <w:rFonts w:ascii="Lora" w:hAnsi="Lora"/>
-                <w:sz w:val="18"/>
-                <w:szCs w:val="18"/>
-              </w:rPr>
-            </w:pPr>
-            <w:r>
-              <w:rPr>
-                <w:rFonts w:ascii="Lora" w:hAnsi="Lora"/>
-                <w:sz w:val="18"/>
-                <w:szCs w:val="18"/>
+              <w:spacing w:line="276" w:lineRule="auto"/>
+              <w:rPr>
+                <w:rFonts w:ascii="Lora" w:hAnsi="Lora"/>
+                <w:sz w:val="16"/>
+                <w:szCs w:val="16"/>
+              </w:rPr>
+            </w:pPr>
+            <w:r>
+              <w:rPr>
+                <w:rFonts w:ascii="Lora" w:hAnsi="Lora"/>
+                <w:sz w:val="16"/>
+                <w:szCs w:val="16"/>
               </w:rPr>
               <w:t>Saturday</w:t>
             </w:r>
@@ -1844,17 +1879,18 @@
           </w:tcPr>
           <w:p>
             <w:pPr>
-              <w:rPr>
-                <w:rFonts w:ascii="Lora" w:hAnsi="Lora"/>
-                <w:sz w:val="18"/>
-                <w:szCs w:val="18"/>
-              </w:rPr>
-            </w:pPr>
-            <w:r>
-              <w:rPr>
-                <w:rFonts w:ascii="Lora" w:hAnsi="Lora"/>
-                <w:sz w:val="18"/>
-                <w:szCs w:val="18"/>
+              <w:spacing w:line="276" w:lineRule="auto"/>
+              <w:rPr>
+                <w:rFonts w:ascii="Lora" w:hAnsi="Lora"/>
+                <w:sz w:val="16"/>
+                <w:szCs w:val="16"/>
+              </w:rPr>
+            </w:pPr>
+            <w:r>
+              <w:rPr>
+                <w:rFonts w:ascii="Lora" w:hAnsi="Lora"/>
+                <w:sz w:val="16"/>
+                <w:szCs w:val="16"/>
               </w:rPr>
               <w:t>2400</w:t>
             </w:r>
@@ -1941,11 +1977,11 @@
                 </w:tcPr>
                 <w:p>
                   <w:pPr>
-                    <w:spacing w:after="0" w:line="240" w:lineRule="auto"/>
+                    <w:spacing w:after="0" w:line="276" w:lineRule="auto"/>
                     <w:rPr>
                       <w:rFonts w:ascii="Lora" w:eastAsia="Times New Roman" w:hAnsi="Lora" w:cs="Times New Roman"/>
-                      <w:sz w:val="18"/>
-                      <w:szCs w:val="18"/>
+                      <w:sz w:val="16"/>
+                      <w:szCs w:val="16"/>
                     </w:rPr>
                   </w:pPr>
                 </w:p>
@@ -1954,11 +1990,12 @@
           </w:tbl>
           <w:p>
             <w:pPr>
+              <w:spacing w:line="276" w:lineRule="auto"/>
               <w:rPr>
                 <w:rFonts w:ascii="Lora" w:eastAsia="Times New Roman" w:hAnsi="Lora" w:cs="Times New Roman"/>
                 <w:vanish/>
-                <w:sz w:val="18"/>
-                <w:szCs w:val="18"/>
+                <w:sz w:val="16"/>
+                <w:szCs w:val="16"/>
               </w:rPr>
             </w:pPr>
           </w:p>
@@ -1975,7 +2012,7 @@
               <w:tblLook w:val="04A0" w:firstRow="1" w:lastRow="0" w:firstColumn="1" w:lastColumn="0" w:noHBand="0" w:noVBand="1"/>
             </w:tblPr>
             <w:tblGrid>
-              <w:gridCol w:w="1529"/>
+              <w:gridCol w:w="1449"/>
             </w:tblGrid>
             <w:tr>
               <w:trPr>
@@ -1989,18 +2026,18 @@
                 </w:tcPr>
                 <w:p>
                   <w:pPr>
-                    <w:spacing w:after="0" w:line="240" w:lineRule="auto"/>
+                    <w:spacing w:after="0" w:line="276" w:lineRule="auto"/>
                     <w:rPr>
                       <w:rFonts w:ascii="Lora" w:eastAsia="Times New Roman" w:hAnsi="Lora" w:cs="Times New Roman"/>
-                      <w:sz w:val="18"/>
-                      <w:szCs w:val="18"/>
+                      <w:sz w:val="16"/>
+                      <w:szCs w:val="16"/>
                     </w:rPr>
                   </w:pPr>
                   <w:r>
                     <w:rPr>
                       <w:rFonts w:ascii="Lora" w:eastAsia="Times New Roman" w:hAnsi="Lora" w:cs="Times New Roman"/>
-                      <w:sz w:val="18"/>
-                      <w:szCs w:val="18"/>
+                      <w:sz w:val="16"/>
+                      <w:szCs w:val="16"/>
                     </w:rPr>
                     <w:t>Holiday surcharge</w:t>
                   </w:r>
@@ -2010,10 +2047,11 @@
           </w:tbl>
           <w:p>
             <w:pPr>
-              <w:rPr>
-                <w:rFonts w:ascii="Lora" w:hAnsi="Lora"/>
-                <w:sz w:val="18"/>
-                <w:szCs w:val="18"/>
+              <w:spacing w:line="276" w:lineRule="auto"/>
+              <w:rPr>
+                <w:rFonts w:ascii="Lora" w:hAnsi="Lora"/>
+                <w:sz w:val="16"/>
+                <w:szCs w:val="16"/>
               </w:rPr>
             </w:pPr>
           </w:p>
@@ -2025,17 +2063,18 @@
           </w:tcPr>
           <w:p>
             <w:pPr>
-              <w:rPr>
-                <w:rFonts w:ascii="Lora" w:hAnsi="Lora"/>
-                <w:sz w:val="18"/>
-                <w:szCs w:val="18"/>
-              </w:rPr>
-            </w:pPr>
-            <w:r>
-              <w:rPr>
-                <w:rFonts w:ascii="Lora" w:hAnsi="Lora"/>
-                <w:sz w:val="18"/>
-                <w:szCs w:val="18"/>
+              <w:spacing w:line="276" w:lineRule="auto"/>
+              <w:rPr>
+                <w:rFonts w:ascii="Lora" w:hAnsi="Lora"/>
+                <w:sz w:val="16"/>
+                <w:szCs w:val="16"/>
+              </w:rPr>
+            </w:pPr>
+            <w:r>
+              <w:rPr>
+                <w:rFonts w:ascii="Lora" w:hAnsi="Lora"/>
+                <w:sz w:val="16"/>
+                <w:szCs w:val="16"/>
               </w:rPr>
               <w:t>Car</w:t>
             </w:r>
@@ -2048,17 +2087,18 @@
           </w:tcPr>
           <w:p>
             <w:pPr>
-              <w:rPr>
-                <w:rFonts w:ascii="Lora" w:hAnsi="Lora"/>
-                <w:sz w:val="18"/>
-                <w:szCs w:val="18"/>
-              </w:rPr>
-            </w:pPr>
-            <w:r>
-              <w:rPr>
-                <w:rFonts w:ascii="Lora" w:hAnsi="Lora"/>
-                <w:sz w:val="18"/>
-                <w:szCs w:val="18"/>
+              <w:spacing w:line="276" w:lineRule="auto"/>
+              <w:rPr>
+                <w:rFonts w:ascii="Lora" w:hAnsi="Lora"/>
+                <w:sz w:val="16"/>
+                <w:szCs w:val="16"/>
+              </w:rPr>
+            </w:pPr>
+            <w:r>
+              <w:rPr>
+                <w:rFonts w:ascii="Lora" w:hAnsi="Lora"/>
+                <w:sz w:val="16"/>
+                <w:szCs w:val="16"/>
               </w:rPr>
               <w:t>2h</w:t>
             </w:r>
@@ -2071,17 +2111,18 @@
           </w:tcPr>
           <w:p>
             <w:pPr>
-              <w:rPr>
-                <w:rFonts w:ascii="Lora" w:hAnsi="Lora"/>
-                <w:sz w:val="18"/>
-                <w:szCs w:val="18"/>
-              </w:rPr>
-            </w:pPr>
-            <w:r>
-              <w:rPr>
-                <w:rFonts w:ascii="Lora" w:hAnsi="Lora"/>
-                <w:sz w:val="18"/>
-                <w:szCs w:val="18"/>
+              <w:spacing w:line="276" w:lineRule="auto"/>
+              <w:rPr>
+                <w:rFonts w:ascii="Lora" w:hAnsi="Lora"/>
+                <w:sz w:val="16"/>
+                <w:szCs w:val="16"/>
+              </w:rPr>
+            </w:pPr>
+            <w:r>
+              <w:rPr>
+                <w:rFonts w:ascii="Lora" w:hAnsi="Lora"/>
+                <w:sz w:val="16"/>
+                <w:szCs w:val="16"/>
               </w:rPr>
               <w:t>Guest</w:t>
             </w:r>
@@ -2094,17 +2135,18 @@
           </w:tcPr>
           <w:p>
             <w:pPr>
-              <w:rPr>
-                <w:rFonts w:ascii="Lora" w:hAnsi="Lora"/>
-                <w:sz w:val="18"/>
-                <w:szCs w:val="18"/>
-              </w:rPr>
-            </w:pPr>
-            <w:r>
-              <w:rPr>
-                <w:rFonts w:ascii="Lora" w:hAnsi="Lora"/>
-                <w:sz w:val="18"/>
-                <w:szCs w:val="18"/>
+              <w:spacing w:line="276" w:lineRule="auto"/>
+              <w:rPr>
+                <w:rFonts w:ascii="Lora" w:hAnsi="Lora"/>
+                <w:sz w:val="16"/>
+                <w:szCs w:val="16"/>
+              </w:rPr>
+            </w:pPr>
+            <w:r>
+              <w:rPr>
+                <w:rFonts w:ascii="Lora" w:hAnsi="Lora"/>
+                <w:sz w:val="16"/>
+                <w:szCs w:val="16"/>
               </w:rPr>
               <w:t>Holiday</w:t>
             </w:r>
@@ -2117,17 +2159,18 @@
           </w:tcPr>
           <w:p>
             <w:pPr>
-              <w:rPr>
-                <w:rFonts w:ascii="Lora" w:hAnsi="Lora"/>
-                <w:sz w:val="18"/>
-                <w:szCs w:val="18"/>
-              </w:rPr>
-            </w:pPr>
-            <w:r>
-              <w:rPr>
-                <w:rFonts w:ascii="Lora" w:hAnsi="Lora"/>
-                <w:sz w:val="18"/>
-                <w:szCs w:val="18"/>
+              <w:spacing w:line="276" w:lineRule="auto"/>
+              <w:rPr>
+                <w:rFonts w:ascii="Lora" w:hAnsi="Lora"/>
+                <w:sz w:val="16"/>
+                <w:szCs w:val="16"/>
+              </w:rPr>
+            </w:pPr>
+            <w:r>
+              <w:rPr>
+                <w:rFonts w:ascii="Lora" w:hAnsi="Lora"/>
+                <w:sz w:val="16"/>
+                <w:szCs w:val="16"/>
               </w:rPr>
               <w:t>3000</w:t>
             </w:r>
@@ -2189,17 +2232,18 @@
           </w:tcPr>
           <w:p>
             <w:pPr>
-              <w:rPr>
-                <w:rFonts w:ascii="Lora" w:hAnsi="Lora"/>
-                <w:sz w:val="18"/>
-                <w:szCs w:val="18"/>
-              </w:rPr>
-            </w:pPr>
-            <w:r>
-              <w:rPr>
-                <w:rFonts w:ascii="Lora" w:hAnsi="Lora"/>
-                <w:sz w:val="18"/>
-                <w:szCs w:val="18"/>
+              <w:spacing w:line="276" w:lineRule="auto"/>
+              <w:rPr>
+                <w:rFonts w:ascii="Lora" w:hAnsi="Lora"/>
+                <w:sz w:val="16"/>
+                <w:szCs w:val="16"/>
+              </w:rPr>
+            </w:pPr>
+            <w:r>
+              <w:rPr>
+                <w:rFonts w:ascii="Lora" w:hAnsi="Lora"/>
+                <w:sz w:val="16"/>
+                <w:szCs w:val="16"/>
               </w:rPr>
               <w:t>Silver discount</w:t>
             </w:r>
@@ -2212,17 +2256,18 @@
           </w:tcPr>
           <w:p>
             <w:pPr>
-              <w:rPr>
-                <w:rFonts w:ascii="Lora" w:hAnsi="Lora"/>
-                <w:sz w:val="18"/>
-                <w:szCs w:val="18"/>
-              </w:rPr>
-            </w:pPr>
-            <w:r>
-              <w:rPr>
-                <w:rFonts w:ascii="Lora" w:hAnsi="Lora"/>
-                <w:sz w:val="18"/>
-                <w:szCs w:val="18"/>
+              <w:spacing w:line="276" w:lineRule="auto"/>
+              <w:rPr>
+                <w:rFonts w:ascii="Lora" w:hAnsi="Lora"/>
+                <w:sz w:val="16"/>
+                <w:szCs w:val="16"/>
+              </w:rPr>
+            </w:pPr>
+            <w:r>
+              <w:rPr>
+                <w:rFonts w:ascii="Lora" w:hAnsi="Lora"/>
+                <w:sz w:val="16"/>
+                <w:szCs w:val="16"/>
               </w:rPr>
               <w:t>Car</w:t>
             </w:r>
@@ -2235,17 +2280,18 @@
           </w:tcPr>
           <w:p>
             <w:pPr>
-              <w:rPr>
-                <w:rFonts w:ascii="Lora" w:hAnsi="Lora"/>
-                <w:sz w:val="18"/>
-                <w:szCs w:val="18"/>
-              </w:rPr>
-            </w:pPr>
-            <w:r>
-              <w:rPr>
-                <w:rFonts w:ascii="Lora" w:hAnsi="Lora"/>
-                <w:sz w:val="18"/>
-                <w:szCs w:val="18"/>
+              <w:spacing w:line="276" w:lineRule="auto"/>
+              <w:rPr>
+                <w:rFonts w:ascii="Lora" w:hAnsi="Lora"/>
+                <w:sz w:val="16"/>
+                <w:szCs w:val="16"/>
+              </w:rPr>
+            </w:pPr>
+            <w:r>
+              <w:rPr>
+                <w:rFonts w:ascii="Lora" w:hAnsi="Lora"/>
+                <w:sz w:val="16"/>
+                <w:szCs w:val="16"/>
               </w:rPr>
               <w:t>2h</w:t>
             </w:r>
@@ -2258,17 +2304,18 @@
           </w:tcPr>
           <w:p>
             <w:pPr>
-              <w:rPr>
-                <w:rFonts w:ascii="Lora" w:hAnsi="Lora"/>
-                <w:sz w:val="18"/>
-                <w:szCs w:val="18"/>
-              </w:rPr>
-            </w:pPr>
-            <w:r>
-              <w:rPr>
-                <w:rFonts w:ascii="Lora" w:hAnsi="Lora"/>
-                <w:sz w:val="18"/>
-                <w:szCs w:val="18"/>
+              <w:spacing w:line="276" w:lineRule="auto"/>
+              <w:rPr>
+                <w:rFonts w:ascii="Lora" w:hAnsi="Lora"/>
+                <w:sz w:val="16"/>
+                <w:szCs w:val="16"/>
+              </w:rPr>
+            </w:pPr>
+            <w:r>
+              <w:rPr>
+                <w:rFonts w:ascii="Lora" w:hAnsi="Lora"/>
+                <w:sz w:val="16"/>
+                <w:szCs w:val="16"/>
               </w:rPr>
               <w:t>Guest</w:t>
             </w:r>
@@ -2281,17 +2328,18 @@
           </w:tcPr>
           <w:p>
             <w:pPr>
-              <w:rPr>
-                <w:rFonts w:ascii="Lora" w:hAnsi="Lora"/>
-                <w:sz w:val="18"/>
-                <w:szCs w:val="18"/>
-              </w:rPr>
-            </w:pPr>
-            <w:r>
-              <w:rPr>
-                <w:rFonts w:ascii="Lora" w:hAnsi="Lora"/>
-                <w:sz w:val="18"/>
-                <w:szCs w:val="18"/>
+              <w:spacing w:line="276" w:lineRule="auto"/>
+              <w:rPr>
+                <w:rFonts w:ascii="Lora" w:hAnsi="Lora"/>
+                <w:sz w:val="16"/>
+                <w:szCs w:val="16"/>
+              </w:rPr>
+            </w:pPr>
+            <w:r>
+              <w:rPr>
+                <w:rFonts w:ascii="Lora" w:hAnsi="Lora"/>
+                <w:sz w:val="16"/>
+                <w:szCs w:val="16"/>
               </w:rPr>
               <w:t>None</w:t>
             </w:r>
@@ -2304,17 +2352,18 @@
           </w:tcPr>
           <w:p>
             <w:pPr>
-              <w:rPr>
-                <w:rFonts w:ascii="Lora" w:hAnsi="Lora"/>
-                <w:sz w:val="18"/>
-                <w:szCs w:val="18"/>
-              </w:rPr>
-            </w:pPr>
-            <w:r>
-              <w:rPr>
-                <w:rFonts w:ascii="Lora" w:hAnsi="Lora"/>
-                <w:sz w:val="18"/>
-                <w:szCs w:val="18"/>
+              <w:spacing w:line="276" w:lineRule="auto"/>
+              <w:rPr>
+                <w:rFonts w:ascii="Lora" w:hAnsi="Lora"/>
+                <w:sz w:val="16"/>
+                <w:szCs w:val="16"/>
+              </w:rPr>
+            </w:pPr>
+            <w:r>
+              <w:rPr>
+                <w:rFonts w:ascii="Lora" w:hAnsi="Lora"/>
+                <w:sz w:val="16"/>
+                <w:szCs w:val="16"/>
               </w:rPr>
               <w:t>1800</w:t>
             </w:r>
@@ -2401,11 +2450,11 @@
                 </w:tcPr>
                 <w:p>
                   <w:pPr>
-                    <w:spacing w:after="0" w:line="240" w:lineRule="auto"/>
+                    <w:spacing w:after="0" w:line="276" w:lineRule="auto"/>
                     <w:rPr>
                       <w:rFonts w:ascii="Lora" w:eastAsia="Times New Roman" w:hAnsi="Lora" w:cs="Times New Roman"/>
-                      <w:sz w:val="18"/>
-                      <w:szCs w:val="18"/>
+                      <w:sz w:val="16"/>
+                      <w:szCs w:val="16"/>
                     </w:rPr>
                   </w:pPr>
                 </w:p>
@@ -2414,11 +2463,12 @@
           </w:tbl>
           <w:p>
             <w:pPr>
+              <w:spacing w:line="276" w:lineRule="auto"/>
               <w:rPr>
                 <w:rFonts w:ascii="Lora" w:eastAsia="Times New Roman" w:hAnsi="Lora" w:cs="Times New Roman"/>
                 <w:vanish/>
-                <w:sz w:val="18"/>
-                <w:szCs w:val="18"/>
+                <w:sz w:val="16"/>
+                <w:szCs w:val="16"/>
               </w:rPr>
             </w:pPr>
           </w:p>
@@ -2435,7 +2485,7 @@
               <w:tblLook w:val="04A0" w:firstRow="1" w:lastRow="0" w:firstColumn="1" w:lastColumn="0" w:noHBand="0" w:noVBand="1"/>
             </w:tblPr>
             <w:tblGrid>
-              <w:gridCol w:w="980"/>
+              <w:gridCol w:w="881"/>
             </w:tblGrid>
             <w:tr>
               <w:trPr>
@@ -2449,18 +2499,18 @@
                 </w:tcPr>
                 <w:p>
                   <w:pPr>
-                    <w:spacing w:after="0" w:line="240" w:lineRule="auto"/>
+                    <w:spacing w:after="0" w:line="276" w:lineRule="auto"/>
                     <w:rPr>
                       <w:rFonts w:ascii="Lora" w:eastAsia="Times New Roman" w:hAnsi="Lora" w:cs="Times New Roman"/>
-                      <w:sz w:val="18"/>
-                      <w:szCs w:val="18"/>
+                      <w:sz w:val="16"/>
+                      <w:szCs w:val="16"/>
                     </w:rPr>
                   </w:pPr>
                   <w:r>
                     <w:rPr>
                       <w:rFonts w:ascii="Lora" w:eastAsia="Times New Roman" w:hAnsi="Lora" w:cs="Times New Roman"/>
-                      <w:sz w:val="18"/>
-                      <w:szCs w:val="18"/>
+                      <w:sz w:val="16"/>
+                      <w:szCs w:val="16"/>
                     </w:rPr>
                     <w:t>Lost ticket</w:t>
                   </w:r>
@@ -2470,10 +2520,11 @@
           </w:tbl>
           <w:p>
             <w:pPr>
-              <w:rPr>
-                <w:rFonts w:ascii="Lora" w:hAnsi="Lora"/>
-                <w:sz w:val="18"/>
-                <w:szCs w:val="18"/>
+              <w:spacing w:line="276" w:lineRule="auto"/>
+              <w:rPr>
+                <w:rFonts w:ascii="Lora" w:hAnsi="Lora"/>
+                <w:sz w:val="16"/>
+                <w:szCs w:val="16"/>
               </w:rPr>
             </w:pPr>
           </w:p>
@@ -2485,17 +2536,18 @@
           </w:tcPr>
           <w:p>
             <w:pPr>
-              <w:rPr>
-                <w:rFonts w:ascii="Lora" w:hAnsi="Lora"/>
-                <w:sz w:val="18"/>
-                <w:szCs w:val="18"/>
-              </w:rPr>
-            </w:pPr>
-            <w:r>
-              <w:rPr>
-                <w:rFonts w:ascii="Lora" w:hAnsi="Lora"/>
-                <w:sz w:val="18"/>
-                <w:szCs w:val="18"/>
+              <w:spacing w:line="276" w:lineRule="auto"/>
+              <w:rPr>
+                <w:rFonts w:ascii="Lora" w:hAnsi="Lora"/>
+                <w:sz w:val="16"/>
+                <w:szCs w:val="16"/>
+              </w:rPr>
+            </w:pPr>
+            <w:r>
+              <w:rPr>
+                <w:rFonts w:ascii="Lora" w:hAnsi="Lora"/>
+                <w:sz w:val="16"/>
+                <w:szCs w:val="16"/>
               </w:rPr>
               <w:t>Car</w:t>
             </w:r>
@@ -2508,17 +2560,18 @@
           </w:tcPr>
           <w:p>
             <w:pPr>
-              <w:rPr>
-                <w:rFonts w:ascii="Lora" w:hAnsi="Lora"/>
-                <w:sz w:val="18"/>
-                <w:szCs w:val="18"/>
-              </w:rPr>
-            </w:pPr>
-            <w:r>
-              <w:rPr>
-                <w:rFonts w:ascii="Lora" w:hAnsi="Lora"/>
-                <w:sz w:val="18"/>
-                <w:szCs w:val="18"/>
+              <w:spacing w:line="276" w:lineRule="auto"/>
+              <w:rPr>
+                <w:rFonts w:ascii="Lora" w:hAnsi="Lora"/>
+                <w:sz w:val="16"/>
+                <w:szCs w:val="16"/>
+              </w:rPr>
+            </w:pPr>
+            <w:r>
+              <w:rPr>
+                <w:rFonts w:ascii="Lora" w:hAnsi="Lora"/>
+                <w:sz w:val="16"/>
+                <w:szCs w:val="16"/>
               </w:rPr>
               <w:t>1h</w:t>
             </w:r>
@@ -2531,17 +2584,18 @@
           </w:tcPr>
           <w:p>
             <w:pPr>
-              <w:rPr>
-                <w:rFonts w:ascii="Lora" w:hAnsi="Lora"/>
-                <w:sz w:val="18"/>
-                <w:szCs w:val="18"/>
-              </w:rPr>
-            </w:pPr>
-            <w:r>
-              <w:rPr>
-                <w:rFonts w:ascii="Lora" w:hAnsi="Lora"/>
-                <w:sz w:val="18"/>
-                <w:szCs w:val="18"/>
+              <w:spacing w:line="276" w:lineRule="auto"/>
+              <w:rPr>
+                <w:rFonts w:ascii="Lora" w:hAnsi="Lora"/>
+                <w:sz w:val="16"/>
+                <w:szCs w:val="16"/>
+              </w:rPr>
+            </w:pPr>
+            <w:r>
+              <w:rPr>
+                <w:rFonts w:ascii="Lora" w:hAnsi="Lora"/>
+                <w:sz w:val="16"/>
+                <w:szCs w:val="16"/>
               </w:rPr>
               <w:t>Guest</w:t>
             </w:r>
@@ -2554,17 +2608,18 @@
           </w:tcPr>
           <w:p>
             <w:pPr>
-              <w:rPr>
-                <w:rFonts w:ascii="Lora" w:hAnsi="Lora"/>
-                <w:sz w:val="18"/>
-                <w:szCs w:val="18"/>
-              </w:rPr>
-            </w:pPr>
-            <w:r>
-              <w:rPr>
-                <w:rFonts w:ascii="Lora" w:hAnsi="Lora"/>
-                <w:sz w:val="18"/>
-                <w:szCs w:val="18"/>
+              <w:spacing w:line="276" w:lineRule="auto"/>
+              <w:rPr>
+                <w:rFonts w:ascii="Lora" w:hAnsi="Lora"/>
+                <w:sz w:val="16"/>
+                <w:szCs w:val="16"/>
+              </w:rPr>
+            </w:pPr>
+            <w:r>
+              <w:rPr>
+                <w:rFonts w:ascii="Lora" w:hAnsi="Lora"/>
+                <w:sz w:val="16"/>
+                <w:szCs w:val="16"/>
               </w:rPr>
               <w:t>Lost</w:t>
             </w:r>
@@ -2577,17 +2632,18 @@
           </w:tcPr>
           <w:p>
             <w:pPr>
-              <w:rPr>
-                <w:rFonts w:ascii="Lora" w:hAnsi="Lora"/>
-                <w:sz w:val="18"/>
-                <w:szCs w:val="18"/>
-              </w:rPr>
-            </w:pPr>
-            <w:r>
-              <w:rPr>
-                <w:rFonts w:ascii="Lora" w:hAnsi="Lora"/>
-                <w:sz w:val="18"/>
-                <w:szCs w:val="18"/>
+              <w:spacing w:line="276" w:lineRule="auto"/>
+              <w:rPr>
+                <w:rFonts w:ascii="Lora" w:hAnsi="Lora"/>
+                <w:sz w:val="16"/>
+                <w:szCs w:val="16"/>
+              </w:rPr>
+            </w:pPr>
+            <w:r>
+              <w:rPr>
+                <w:rFonts w:ascii="Lora" w:hAnsi="Lora"/>
+                <w:sz w:val="16"/>
+                <w:szCs w:val="16"/>
               </w:rPr>
               <w:t>21000</w:t>
             </w:r>
@@ -2649,17 +2705,18 @@
           </w:tcPr>
           <w:p>
             <w:pPr>
-              <w:rPr>
-                <w:rFonts w:ascii="Lora" w:hAnsi="Lora"/>
-                <w:sz w:val="18"/>
-                <w:szCs w:val="18"/>
-              </w:rPr>
-            </w:pPr>
-            <w:r>
-              <w:rPr>
-                <w:rFonts w:ascii="Lora" w:hAnsi="Lora"/>
-                <w:sz w:val="18"/>
-                <w:szCs w:val="18"/>
+              <w:spacing w:line="276" w:lineRule="auto"/>
+              <w:rPr>
+                <w:rFonts w:ascii="Lora" w:hAnsi="Lora"/>
+                <w:sz w:val="16"/>
+                <w:szCs w:val="16"/>
+              </w:rPr>
+            </w:pPr>
+            <w:r>
+              <w:rPr>
+                <w:rFonts w:ascii="Lora" w:hAnsi="Lora"/>
+                <w:sz w:val="16"/>
+                <w:szCs w:val="16"/>
               </w:rPr>
               <w:t>Invalid time</w:t>
             </w:r>
@@ -2672,17 +2729,18 @@
           </w:tcPr>
           <w:p>
             <w:pPr>
-              <w:rPr>
-                <w:rFonts w:ascii="Lora" w:hAnsi="Lora"/>
-                <w:sz w:val="18"/>
-                <w:szCs w:val="18"/>
-              </w:rPr>
-            </w:pPr>
-            <w:r>
-              <w:rPr>
-                <w:rFonts w:ascii="Lora" w:hAnsi="Lora"/>
-                <w:sz w:val="18"/>
-                <w:szCs w:val="18"/>
+              <w:spacing w:line="276" w:lineRule="auto"/>
+              <w:rPr>
+                <w:rFonts w:ascii="Lora" w:hAnsi="Lora"/>
+                <w:sz w:val="16"/>
+                <w:szCs w:val="16"/>
+              </w:rPr>
+            </w:pPr>
+            <w:r>
+              <w:rPr>
+                <w:rFonts w:ascii="Lora" w:hAnsi="Lora"/>
+                <w:sz w:val="16"/>
+                <w:szCs w:val="16"/>
               </w:rPr>
               <w:t>Car</w:t>
             </w:r>
@@ -2695,17 +2753,18 @@
           </w:tcPr>
           <w:p>
             <w:pPr>
-              <w:rPr>
-                <w:rFonts w:ascii="Lora" w:hAnsi="Lora"/>
-                <w:sz w:val="18"/>
-                <w:szCs w:val="18"/>
-              </w:rPr>
-            </w:pPr>
-            <w:r>
-              <w:rPr>
-                <w:rFonts w:ascii="Lora" w:hAnsi="Lora"/>
-                <w:sz w:val="18"/>
-                <w:szCs w:val="18"/>
+              <w:spacing w:line="276" w:lineRule="auto"/>
+              <w:rPr>
+                <w:rFonts w:ascii="Lora" w:hAnsi="Lora"/>
+                <w:sz w:val="16"/>
+                <w:szCs w:val="16"/>
+              </w:rPr>
+            </w:pPr>
+            <w:r>
+              <w:rPr>
+                <w:rFonts w:ascii="Lora" w:hAnsi="Lora"/>
+                <w:sz w:val="16"/>
+                <w:szCs w:val="16"/>
               </w:rPr>
               <w:t>invalid</w:t>
             </w:r>
@@ -2718,17 +2777,18 @@
           </w:tcPr>
           <w:p>
             <w:pPr>
-              <w:rPr>
-                <w:rFonts w:ascii="Lora" w:hAnsi="Lora"/>
-                <w:sz w:val="18"/>
-                <w:szCs w:val="18"/>
-              </w:rPr>
-            </w:pPr>
-            <w:r>
-              <w:rPr>
-                <w:rFonts w:ascii="Lora" w:hAnsi="Lora"/>
-                <w:sz w:val="18"/>
-                <w:szCs w:val="18"/>
+              <w:spacing w:line="276" w:lineRule="auto"/>
+              <w:rPr>
+                <w:rFonts w:ascii="Lora" w:hAnsi="Lora"/>
+                <w:sz w:val="16"/>
+                <w:szCs w:val="16"/>
+              </w:rPr>
+            </w:pPr>
+            <w:r>
+              <w:rPr>
+                <w:rFonts w:ascii="Lora" w:hAnsi="Lora"/>
+                <w:sz w:val="16"/>
+                <w:szCs w:val="16"/>
               </w:rPr>
               <w:t>Guest</w:t>
             </w:r>
@@ -2741,17 +2801,18 @@
           </w:tcPr>
           <w:p>
             <w:pPr>
-              <w:rPr>
-                <w:rFonts w:ascii="Lora" w:hAnsi="Lora"/>
-                <w:sz w:val="18"/>
-                <w:szCs w:val="18"/>
-              </w:rPr>
-            </w:pPr>
-            <w:r>
-              <w:rPr>
-                <w:rFonts w:ascii="Lora" w:hAnsi="Lora"/>
-                <w:sz w:val="18"/>
-                <w:szCs w:val="18"/>
+              <w:spacing w:line="276" w:lineRule="auto"/>
+              <w:rPr>
+                <w:rFonts w:ascii="Lora" w:hAnsi="Lora"/>
+                <w:sz w:val="16"/>
+                <w:szCs w:val="16"/>
+              </w:rPr>
+            </w:pPr>
+            <w:r>
+              <w:rPr>
+                <w:rFonts w:ascii="Lora" w:hAnsi="Lora"/>
+                <w:sz w:val="16"/>
+                <w:szCs w:val="16"/>
               </w:rPr>
               <w:t>None</w:t>
             </w:r>
@@ -2764,17 +2825,18 @@
           </w:tcPr>
           <w:p>
             <w:pPr>
-              <w:rPr>
-                <w:rFonts w:ascii="Lora" w:hAnsi="Lora"/>
-                <w:sz w:val="18"/>
-                <w:szCs w:val="18"/>
-              </w:rPr>
-            </w:pPr>
-            <w:r>
-              <w:rPr>
-                <w:rFonts w:ascii="Lora" w:hAnsi="Lora"/>
-                <w:sz w:val="18"/>
-                <w:szCs w:val="18"/>
+              <w:spacing w:line="276" w:lineRule="auto"/>
+              <w:rPr>
+                <w:rFonts w:ascii="Lora" w:hAnsi="Lora"/>
+                <w:sz w:val="16"/>
+                <w:szCs w:val="16"/>
+              </w:rPr>
+            </w:pPr>
+            <w:r>
+              <w:rPr>
+                <w:rFonts w:ascii="Lora" w:hAnsi="Lora"/>
+                <w:sz w:val="16"/>
+                <w:szCs w:val="16"/>
               </w:rPr>
               <w:t>Exception</w:t>
             </w:r>
@@ -2797,6 +2859,16 @@
         </w:tc>
       </w:tr>
     </w:tbl>
+    <w:p>
+      <w:pPr>
+        <w:rPr>
+          <w:rFonts w:ascii="Lora" w:hAnsi="Lora"/>
+          <w:b/>
+          <w:bCs/>
+          <w:szCs w:val="22"/>
+        </w:rPr>
+      </w:pPr>
+    </w:p>
     <w:p>
       <w:pPr>
         <w:rPr>
@@ -2835,11 +2907,11 @@
         <w:tblLook w:val="04A0" w:firstRow="1" w:lastRow="0" w:firstColumn="1" w:lastColumn="0" w:noHBand="0" w:noVBand="1"/>
       </w:tblPr>
       <w:tblGrid>
-        <w:gridCol w:w="400"/>
-        <w:gridCol w:w="1648"/>
-        <w:gridCol w:w="3152"/>
-        <w:gridCol w:w="2425"/>
-        <w:gridCol w:w="1725"/>
+        <w:gridCol w:w="403"/>
+        <w:gridCol w:w="1759"/>
+        <w:gridCol w:w="2826"/>
+        <w:gridCol w:w="2605"/>
+        <w:gridCol w:w="1757"/>
       </w:tblGrid>
       <w:tr>
         <w:trPr>
@@ -2848,6 +2920,7 @@
         <w:tc>
           <w:tcPr>
             <w:tcW w:w="407" w:type="dxa"/>
+            <w:shd w:val="clear" w:color="auto" w:fill="E2EFD9" w:themeFill="accent6" w:themeFillTint="33"/>
             <w:vAlign w:val="center"/>
           </w:tcPr>
           <w:p>
@@ -2876,6 +2949,7 @@
         <w:tc>
           <w:tcPr>
             <w:tcW w:w="1967" w:type="dxa"/>
+            <w:shd w:val="clear" w:color="auto" w:fill="E2EFD9" w:themeFill="accent6" w:themeFillTint="33"/>
             <w:vAlign w:val="center"/>
           </w:tcPr>
           <w:p>
@@ -2903,6 +2977,7 @@
         <w:tc>
           <w:tcPr>
             <w:tcW w:w="2157" w:type="dxa"/>
+            <w:shd w:val="clear" w:color="auto" w:fill="E2EFD9" w:themeFill="accent6" w:themeFillTint="33"/>
             <w:vAlign w:val="center"/>
           </w:tcPr>
           <w:p>
@@ -2930,6 +3005,7 @@
         <w:tc>
           <w:tcPr>
             <w:tcW w:w="3034" w:type="dxa"/>
+            <w:shd w:val="clear" w:color="auto" w:fill="E2EFD9" w:themeFill="accent6" w:themeFillTint="33"/>
             <w:vAlign w:val="center"/>
           </w:tcPr>
           <w:p>
@@ -2957,6 +3033,7 @@
         <w:tc>
           <w:tcPr>
             <w:tcW w:w="1785" w:type="dxa"/>
+            <w:shd w:val="clear" w:color="auto" w:fill="E2EFD9" w:themeFill="accent6" w:themeFillTint="33"/>
             <w:vAlign w:val="center"/>
           </w:tcPr>
           <w:p>
@@ -2989,6 +3066,7 @@
         <w:tc>
           <w:tcPr>
             <w:tcW w:w="407" w:type="dxa"/>
+            <w:shd w:val="clear" w:color="auto" w:fill="E2EFD9" w:themeFill="accent6" w:themeFillTint="33"/>
             <w:vAlign w:val="center"/>
           </w:tcPr>
           <w:p>
@@ -3021,17 +3099,18 @@
           </w:tcPr>
           <w:p>
             <w:pPr>
-              <w:rPr>
-                <w:rFonts w:ascii="Lora" w:hAnsi="Lora"/>
-                <w:sz w:val="18"/>
-                <w:szCs w:val="18"/>
-              </w:rPr>
-            </w:pPr>
-            <w:r>
-              <w:rPr>
-                <w:rFonts w:ascii="Lora" w:hAnsi="Lora"/>
-                <w:sz w:val="18"/>
-                <w:szCs w:val="18"/>
+              <w:spacing w:line="276" w:lineRule="auto"/>
+              <w:rPr>
+                <w:rFonts w:ascii="Lora" w:hAnsi="Lora"/>
+                <w:sz w:val="16"/>
+                <w:szCs w:val="16"/>
+              </w:rPr>
+            </w:pPr>
+            <w:r>
+              <w:rPr>
+                <w:rFonts w:ascii="Lora" w:hAnsi="Lora"/>
+                <w:sz w:val="16"/>
+                <w:szCs w:val="16"/>
               </w:rPr>
               <w:t>Successful check-in</w:t>
             </w:r>
@@ -3044,18 +3123,19 @@
           </w:tcPr>
           <w:p>
             <w:pPr>
-              <w:rPr>
-                <w:rFonts w:ascii="Lora" w:hAnsi="Lora"/>
-                <w:sz w:val="18"/>
-                <w:szCs w:val="18"/>
+              <w:spacing w:line="276" w:lineRule="auto"/>
+              <w:rPr>
+                <w:rFonts w:ascii="Lora" w:hAnsi="Lora"/>
+                <w:sz w:val="16"/>
+                <w:szCs w:val="16"/>
               </w:rPr>
             </w:pPr>
             <w:proofErr w:type="spellStart"/>
             <w:r>
               <w:rPr>
                 <w:rFonts w:ascii="Lora" w:hAnsi="Lora"/>
-                <w:sz w:val="18"/>
-                <w:szCs w:val="18"/>
+                <w:sz w:val="16"/>
+                <w:szCs w:val="16"/>
               </w:rPr>
               <w:t>Repo.GetActiveTicketByPlateAsync</w:t>
             </w:r>
@@ -3063,8 +3143,8 @@
             <w:r>
               <w:rPr>
                 <w:rFonts w:ascii="Lora" w:hAnsi="Lora"/>
-                <w:sz w:val="18"/>
-                <w:szCs w:val="18"/>
+                <w:sz w:val="16"/>
+                <w:szCs w:val="16"/>
               </w:rPr>
               <w:t xml:space="preserve"> returns null (no existing ticket)</w:t>
             </w:r>
@@ -3077,17 +3157,18 @@
           </w:tcPr>
           <w:p>
             <w:pPr>
-              <w:rPr>
-                <w:rFonts w:ascii="Lora" w:hAnsi="Lora"/>
-                <w:sz w:val="18"/>
-                <w:szCs w:val="18"/>
-              </w:rPr>
-            </w:pPr>
-            <w:r>
-              <w:rPr>
-                <w:rFonts w:ascii="Lora" w:hAnsi="Lora"/>
-                <w:sz w:val="18"/>
-                <w:szCs w:val="18"/>
+              <w:spacing w:line="276" w:lineRule="auto"/>
+              <w:rPr>
+                <w:rFonts w:ascii="Lora" w:hAnsi="Lora"/>
+                <w:sz w:val="16"/>
+                <w:szCs w:val="16"/>
+              </w:rPr>
+            </w:pPr>
+            <w:r>
+              <w:rPr>
+                <w:rFonts w:ascii="Lora" w:hAnsi="Lora"/>
+                <w:sz w:val="16"/>
+                <w:szCs w:val="16"/>
               </w:rPr>
               <w:t xml:space="preserve">Returns a new </w:t>
             </w:r>
@@ -3095,8 +3176,8 @@
             <w:r>
               <w:rPr>
                 <w:rFonts w:ascii="Lora" w:hAnsi="Lora"/>
-                <w:sz w:val="18"/>
-                <w:szCs w:val="18"/>
+                <w:sz w:val="16"/>
+                <w:szCs w:val="16"/>
               </w:rPr>
               <w:t>ParkingTicket</w:t>
             </w:r>
@@ -3104,8 +3185,8 @@
             <w:r>
               <w:rPr>
                 <w:rFonts w:ascii="Lora" w:hAnsi="Lora"/>
-                <w:sz w:val="18"/>
-                <w:szCs w:val="18"/>
+                <w:sz w:val="16"/>
+                <w:szCs w:val="16"/>
               </w:rPr>
               <w:t xml:space="preserve"> with correct plate and time</w:t>
             </w:r>
@@ -3118,18 +3199,19 @@
           </w:tcPr>
           <w:p>
             <w:pPr>
-              <w:rPr>
-                <w:rFonts w:ascii="Lora" w:hAnsi="Lora"/>
-                <w:sz w:val="18"/>
-                <w:szCs w:val="18"/>
+              <w:spacing w:line="276" w:lineRule="auto"/>
+              <w:rPr>
+                <w:rFonts w:ascii="Lora" w:hAnsi="Lora"/>
+                <w:sz w:val="16"/>
+                <w:szCs w:val="16"/>
               </w:rPr>
             </w:pPr>
             <w:proofErr w:type="spellStart"/>
             <w:r>
               <w:rPr>
                 <w:rFonts w:ascii="Lora" w:hAnsi="Lora"/>
-                <w:sz w:val="18"/>
-                <w:szCs w:val="18"/>
+                <w:sz w:val="16"/>
+                <w:szCs w:val="16"/>
               </w:rPr>
               <w:t>SaveTicketAsync</w:t>
             </w:r>
@@ -3137,8 +3219,8 @@
             <w:r>
               <w:rPr>
                 <w:rFonts w:ascii="Lora" w:hAnsi="Lora"/>
-                <w:sz w:val="18"/>
-                <w:szCs w:val="18"/>
+                <w:sz w:val="16"/>
+                <w:szCs w:val="16"/>
               </w:rPr>
               <w:t xml:space="preserve"> called exactly once</w:t>
             </w:r>
@@ -3152,6 +3234,7 @@
         <w:tc>
           <w:tcPr>
             <w:tcW w:w="407" w:type="dxa"/>
+            <w:shd w:val="clear" w:color="auto" w:fill="E2EFD9" w:themeFill="accent6" w:themeFillTint="33"/>
             <w:vAlign w:val="center"/>
           </w:tcPr>
           <w:p>
@@ -3184,12 +3267,21 @@
           </w:tcPr>
           <w:p>
             <w:pPr>
-              <w:rPr>
-                <w:rFonts w:ascii="Lora" w:hAnsi="Lora"/>
-                <w:sz w:val="18"/>
-                <w:szCs w:val="18"/>
-              </w:rPr>
-            </w:pPr>
+              <w:spacing w:line="276" w:lineRule="auto"/>
+              <w:rPr>
+                <w:rFonts w:ascii="Lora" w:hAnsi="Lora"/>
+                <w:sz w:val="16"/>
+                <w:szCs w:val="16"/>
+              </w:rPr>
+            </w:pPr>
+            <w:r>
+              <w:rPr>
+                <w:rFonts w:ascii="Lora" w:hAnsi="Lora"/>
+                <w:sz w:val="16"/>
+                <w:szCs w:val="16"/>
+              </w:rPr>
+              <w:t>Duplicate check-in</w:t>
+            </w:r>
           </w:p>
         </w:tc>
         <w:tc>
@@ -3199,12 +3291,21 @@
           </w:tcPr>
           <w:p>
             <w:pPr>
-              <w:rPr>
-                <w:rFonts w:ascii="Lora" w:hAnsi="Lora"/>
-                <w:sz w:val="18"/>
-                <w:szCs w:val="18"/>
-              </w:rPr>
-            </w:pPr>
+              <w:spacing w:line="276" w:lineRule="auto"/>
+              <w:rPr>
+                <w:rFonts w:ascii="Lora" w:hAnsi="Lora"/>
+                <w:sz w:val="16"/>
+                <w:szCs w:val="16"/>
+              </w:rPr>
+            </w:pPr>
+            <w:r>
+              <w:rPr>
+                <w:rFonts w:ascii="Lora" w:hAnsi="Lora"/>
+                <w:sz w:val="16"/>
+                <w:szCs w:val="16"/>
+              </w:rPr>
+              <w:t>Repo returns existing ticket</w:t>
+            </w:r>
           </w:p>
         </w:tc>
         <w:tc>
@@ -3214,12 +3315,21 @@
           </w:tcPr>
           <w:p>
             <w:pPr>
-              <w:rPr>
-                <w:rFonts w:ascii="Lora" w:hAnsi="Lora"/>
-                <w:sz w:val="18"/>
-                <w:szCs w:val="18"/>
-              </w:rPr>
-            </w:pPr>
+              <w:spacing w:line="276" w:lineRule="auto"/>
+              <w:rPr>
+                <w:rFonts w:ascii="Lora" w:hAnsi="Lora"/>
+                <w:sz w:val="16"/>
+                <w:szCs w:val="16"/>
+              </w:rPr>
+            </w:pPr>
+            <w:r>
+              <w:rPr>
+                <w:rFonts w:ascii="Lora" w:hAnsi="Lora"/>
+                <w:sz w:val="16"/>
+                <w:szCs w:val="16"/>
+              </w:rPr>
+              <w:t>Throws exception</w:t>
+            </w:r>
           </w:p>
         </w:tc>
         <w:tc>
@@ -3229,12 +3339,31 @@
           </w:tcPr>
           <w:p>
             <w:pPr>
-              <w:rPr>
-                <w:rFonts w:ascii="Lora" w:hAnsi="Lora"/>
-                <w:sz w:val="18"/>
-                <w:szCs w:val="18"/>
-              </w:rPr>
-            </w:pPr>
+              <w:spacing w:line="276" w:lineRule="auto"/>
+              <w:rPr>
+                <w:rFonts w:ascii="Lora" w:hAnsi="Lora"/>
+                <w:sz w:val="16"/>
+                <w:szCs w:val="16"/>
+              </w:rPr>
+            </w:pPr>
+            <w:proofErr w:type="spellStart"/>
+            <w:r>
+              <w:rPr>
+                <w:rFonts w:ascii="Lora" w:hAnsi="Lora"/>
+                <w:sz w:val="16"/>
+                <w:szCs w:val="16"/>
+              </w:rPr>
+              <w:t>SaveTicketAsync</w:t>
+            </w:r>
+            <w:proofErr w:type="spellEnd"/>
+            <w:r>
+              <w:rPr>
+                <w:rFonts w:ascii="Lora" w:hAnsi="Lora"/>
+                <w:sz w:val="16"/>
+                <w:szCs w:val="16"/>
+              </w:rPr>
+              <w:t xml:space="preserve"> NOT called</w:t>
+            </w:r>
           </w:p>
         </w:tc>
       </w:tr>
@@ -3245,6 +3374,7 @@
         <w:tc>
           <w:tcPr>
             <w:tcW w:w="407" w:type="dxa"/>
+            <w:shd w:val="clear" w:color="auto" w:fill="E2EFD9" w:themeFill="accent6" w:themeFillTint="33"/>
             <w:vAlign w:val="center"/>
           </w:tcPr>
           <w:p>
@@ -3277,12 +3407,21 @@
           </w:tcPr>
           <w:p>
             <w:pPr>
-              <w:rPr>
-                <w:rFonts w:ascii="Lora" w:hAnsi="Lora"/>
-                <w:sz w:val="18"/>
-                <w:szCs w:val="18"/>
-              </w:rPr>
-            </w:pPr>
+              <w:spacing w:line="276" w:lineRule="auto"/>
+              <w:rPr>
+                <w:rFonts w:ascii="Lora" w:hAnsi="Lora"/>
+                <w:sz w:val="16"/>
+                <w:szCs w:val="16"/>
+              </w:rPr>
+            </w:pPr>
+            <w:r>
+              <w:rPr>
+                <w:rFonts w:ascii="Lora" w:hAnsi="Lora"/>
+                <w:sz w:val="16"/>
+                <w:szCs w:val="16"/>
+              </w:rPr>
+              <w:t>Successful check-out</w:t>
+            </w:r>
           </w:p>
         </w:tc>
         <w:tc>
@@ -3292,12 +3431,21 @@
           </w:tcPr>
           <w:p>
             <w:pPr>
-              <w:rPr>
-                <w:rFonts w:ascii="Lora" w:hAnsi="Lora"/>
-                <w:sz w:val="18"/>
-                <w:szCs w:val="18"/>
-              </w:rPr>
-            </w:pPr>
+              <w:spacing w:line="276" w:lineRule="auto"/>
+              <w:rPr>
+                <w:rFonts w:ascii="Lora" w:hAnsi="Lora"/>
+                <w:sz w:val="16"/>
+                <w:szCs w:val="16"/>
+              </w:rPr>
+            </w:pPr>
+            <w:r>
+              <w:rPr>
+                <w:rFonts w:ascii="Lora" w:hAnsi="Lora"/>
+                <w:sz w:val="16"/>
+                <w:szCs w:val="16"/>
+              </w:rPr>
+              <w:t>Payment returns true</w:t>
+            </w:r>
           </w:p>
         </w:tc>
         <w:tc>
@@ -3307,12 +3455,39 @@
           </w:tcPr>
           <w:p>
             <w:pPr>
-              <w:rPr>
-                <w:rFonts w:ascii="Lora" w:hAnsi="Lora"/>
-                <w:sz w:val="18"/>
-                <w:szCs w:val="18"/>
-              </w:rPr>
-            </w:pPr>
+              <w:spacing w:line="276" w:lineRule="auto"/>
+              <w:rPr>
+                <w:rFonts w:ascii="Lora" w:hAnsi="Lora"/>
+                <w:sz w:val="16"/>
+                <w:szCs w:val="16"/>
+              </w:rPr>
+            </w:pPr>
+            <w:r>
+              <w:rPr>
+                <w:rFonts w:ascii="Lora" w:hAnsi="Lora"/>
+                <w:sz w:val="16"/>
+                <w:szCs w:val="16"/>
+              </w:rPr>
+              <w:t xml:space="preserve">Fee </w:t>
+            </w:r>
+            <w:proofErr w:type="gramStart"/>
+            <w:r>
+              <w:rPr>
+                <w:rFonts w:ascii="Lora" w:hAnsi="Lora"/>
+                <w:sz w:val="16"/>
+                <w:szCs w:val="16"/>
+              </w:rPr>
+              <w:t>returned,</w:t>
+            </w:r>
+            <w:proofErr w:type="gramEnd"/>
+            <w:r>
+              <w:rPr>
+                <w:rFonts w:ascii="Lora" w:hAnsi="Lora"/>
+                <w:sz w:val="16"/>
+                <w:szCs w:val="16"/>
+              </w:rPr>
+              <w:t xml:space="preserve"> ticket updated</w:t>
+            </w:r>
           </w:p>
         </w:tc>
         <w:tc>
@@ -3322,12 +3497,57 @@
           </w:tcPr>
           <w:p>
             <w:pPr>
-              <w:rPr>
-                <w:rFonts w:ascii="Lora" w:hAnsi="Lora"/>
-                <w:sz w:val="18"/>
-                <w:szCs w:val="18"/>
-              </w:rPr>
-            </w:pPr>
+              <w:spacing w:line="276" w:lineRule="auto"/>
+              <w:rPr>
+                <w:rFonts w:ascii="Lora" w:hAnsi="Lora"/>
+                <w:sz w:val="16"/>
+                <w:szCs w:val="16"/>
+              </w:rPr>
+            </w:pPr>
+            <w:proofErr w:type="spellStart"/>
+            <w:r>
+              <w:rPr>
+                <w:rFonts w:ascii="Lora" w:hAnsi="Lora"/>
+                <w:sz w:val="16"/>
+                <w:szCs w:val="16"/>
+              </w:rPr>
+              <w:t>UpdateTicketAsync</w:t>
+            </w:r>
+            <w:proofErr w:type="spellEnd"/>
+            <w:r>
+              <w:rPr>
+                <w:rFonts w:ascii="Lora" w:hAnsi="Lora"/>
+                <w:sz w:val="16"/>
+                <w:szCs w:val="16"/>
+              </w:rPr>
+              <w:t xml:space="preserve"> +</w:t>
+            </w:r>
+            <w:r>
+              <w:rPr>
+                <w:rFonts w:ascii="Lora" w:hAnsi="Lora"/>
+                <w:sz w:val="16"/>
+                <w:szCs w:val="16"/>
+              </w:rPr>
+              <w:t xml:space="preserve"> </w:t>
+            </w:r>
+            <w:proofErr w:type="spellStart"/>
+            <w:r>
+              <w:rPr>
+                <w:rFonts w:ascii="Lora" w:hAnsi="Lora"/>
+                <w:sz w:val="16"/>
+                <w:szCs w:val="16"/>
+              </w:rPr>
+              <w:t>SendReceiptAsync</w:t>
+            </w:r>
+            <w:proofErr w:type="spellEnd"/>
+            <w:r>
+              <w:rPr>
+                <w:rFonts w:ascii="Lora" w:hAnsi="Lora"/>
+                <w:sz w:val="16"/>
+                <w:szCs w:val="16"/>
+              </w:rPr>
+              <w:t xml:space="preserve"> called</w:t>
+            </w:r>
           </w:p>
         </w:tc>
       </w:tr>
@@ -3338,6 +3558,7 @@
         <w:tc>
           <w:tcPr>
             <w:tcW w:w="407" w:type="dxa"/>
+            <w:shd w:val="clear" w:color="auto" w:fill="E2EFD9" w:themeFill="accent6" w:themeFillTint="33"/>
             <w:vAlign w:val="center"/>
           </w:tcPr>
           <w:p>
@@ -3370,12 +3591,21 @@
           </w:tcPr>
           <w:p>
             <w:pPr>
-              <w:rPr>
-                <w:rFonts w:ascii="Lora" w:hAnsi="Lora"/>
-                <w:sz w:val="18"/>
-                <w:szCs w:val="18"/>
-              </w:rPr>
-            </w:pPr>
+              <w:spacing w:line="276" w:lineRule="auto"/>
+              <w:rPr>
+                <w:rFonts w:ascii="Lora" w:hAnsi="Lora"/>
+                <w:sz w:val="16"/>
+                <w:szCs w:val="16"/>
+              </w:rPr>
+            </w:pPr>
+            <w:r>
+              <w:rPr>
+                <w:rFonts w:ascii="Lora" w:hAnsi="Lora"/>
+                <w:sz w:val="16"/>
+                <w:szCs w:val="16"/>
+              </w:rPr>
+              <w:t>Payment failure</w:t>
+            </w:r>
           </w:p>
         </w:tc>
         <w:tc>
@@ -3385,12 +3615,21 @@
           </w:tcPr>
           <w:p>
             <w:pPr>
-              <w:rPr>
-                <w:rFonts w:ascii="Lora" w:hAnsi="Lora"/>
-                <w:sz w:val="18"/>
-                <w:szCs w:val="18"/>
-              </w:rPr>
-            </w:pPr>
+              <w:spacing w:line="276" w:lineRule="auto"/>
+              <w:rPr>
+                <w:rFonts w:ascii="Lora" w:hAnsi="Lora"/>
+                <w:sz w:val="16"/>
+                <w:szCs w:val="16"/>
+              </w:rPr>
+            </w:pPr>
+            <w:r>
+              <w:rPr>
+                <w:rFonts w:ascii="Lora" w:hAnsi="Lora"/>
+                <w:sz w:val="16"/>
+                <w:szCs w:val="16"/>
+              </w:rPr>
+              <w:t>Payment returns false</w:t>
+            </w:r>
           </w:p>
         </w:tc>
         <w:tc>
@@ -3400,12 +3639,21 @@
           </w:tcPr>
           <w:p>
             <w:pPr>
-              <w:rPr>
-                <w:rFonts w:ascii="Lora" w:hAnsi="Lora"/>
-                <w:sz w:val="18"/>
-                <w:szCs w:val="18"/>
-              </w:rPr>
-            </w:pPr>
+              <w:spacing w:line="276" w:lineRule="auto"/>
+              <w:rPr>
+                <w:rFonts w:ascii="Lora" w:hAnsi="Lora"/>
+                <w:sz w:val="16"/>
+                <w:szCs w:val="16"/>
+              </w:rPr>
+            </w:pPr>
+            <w:r>
+              <w:rPr>
+                <w:rFonts w:ascii="Lora" w:hAnsi="Lora"/>
+                <w:sz w:val="16"/>
+                <w:szCs w:val="16"/>
+              </w:rPr>
+              <w:t>Throws exception</w:t>
+            </w:r>
           </w:p>
         </w:tc>
         <w:tc>
@@ -3415,12 +3663,31 @@
           </w:tcPr>
           <w:p>
             <w:pPr>
-              <w:rPr>
-                <w:rFonts w:ascii="Lora" w:hAnsi="Lora"/>
-                <w:sz w:val="18"/>
-                <w:szCs w:val="18"/>
-              </w:rPr>
-            </w:pPr>
+              <w:spacing w:line="276" w:lineRule="auto"/>
+              <w:rPr>
+                <w:rFonts w:ascii="Lora" w:hAnsi="Lora"/>
+                <w:sz w:val="16"/>
+                <w:szCs w:val="16"/>
+              </w:rPr>
+            </w:pPr>
+            <w:proofErr w:type="spellStart"/>
+            <w:r>
+              <w:rPr>
+                <w:rFonts w:ascii="Lora" w:hAnsi="Lora"/>
+                <w:sz w:val="16"/>
+                <w:szCs w:val="16"/>
+              </w:rPr>
+              <w:t>UpdateTicketAsync</w:t>
+            </w:r>
+            <w:proofErr w:type="spellEnd"/>
+            <w:r>
+              <w:rPr>
+                <w:rFonts w:ascii="Lora" w:hAnsi="Lora"/>
+                <w:sz w:val="16"/>
+                <w:szCs w:val="16"/>
+              </w:rPr>
+              <w:t xml:space="preserve"> NOT called</w:t>
+            </w:r>
           </w:p>
         </w:tc>
       </w:tr>
@@ -3431,6 +3698,7 @@
         <w:tc>
           <w:tcPr>
             <w:tcW w:w="407" w:type="dxa"/>
+            <w:shd w:val="clear" w:color="auto" w:fill="E2EFD9" w:themeFill="accent6" w:themeFillTint="33"/>
             <w:vAlign w:val="center"/>
           </w:tcPr>
           <w:p>
@@ -3463,12 +3731,21 @@
           </w:tcPr>
           <w:p>
             <w:pPr>
-              <w:rPr>
-                <w:rFonts w:ascii="Lora" w:hAnsi="Lora"/>
-                <w:sz w:val="18"/>
-                <w:szCs w:val="18"/>
-              </w:rPr>
-            </w:pPr>
+              <w:spacing w:line="276" w:lineRule="auto"/>
+              <w:rPr>
+                <w:rFonts w:ascii="Lora" w:hAnsi="Lora"/>
+                <w:sz w:val="16"/>
+                <w:szCs w:val="16"/>
+              </w:rPr>
+            </w:pPr>
+            <w:r>
+              <w:rPr>
+                <w:rFonts w:ascii="Lora" w:hAnsi="Lora"/>
+                <w:sz w:val="16"/>
+                <w:szCs w:val="16"/>
+              </w:rPr>
+              <w:t>Notification failure</w:t>
+            </w:r>
           </w:p>
         </w:tc>
         <w:tc>
@@ -3478,12 +3755,31 @@
           </w:tcPr>
           <w:p>
             <w:pPr>
-              <w:rPr>
-                <w:rFonts w:ascii="Lora" w:hAnsi="Lora"/>
-                <w:sz w:val="18"/>
-                <w:szCs w:val="18"/>
-              </w:rPr>
-            </w:pPr>
+              <w:spacing w:line="276" w:lineRule="auto"/>
+              <w:rPr>
+                <w:rFonts w:ascii="Lora" w:hAnsi="Lora"/>
+                <w:sz w:val="16"/>
+                <w:szCs w:val="16"/>
+              </w:rPr>
+            </w:pPr>
+            <w:proofErr w:type="spellStart"/>
+            <w:r>
+              <w:rPr>
+                <w:rFonts w:ascii="Lora" w:hAnsi="Lora"/>
+                <w:sz w:val="16"/>
+                <w:szCs w:val="16"/>
+              </w:rPr>
+              <w:t>SendReceiptAsync</w:t>
+            </w:r>
+            <w:proofErr w:type="spellEnd"/>
+            <w:r>
+              <w:rPr>
+                <w:rFonts w:ascii="Lora" w:hAnsi="Lora"/>
+                <w:sz w:val="16"/>
+                <w:szCs w:val="16"/>
+              </w:rPr>
+              <w:t xml:space="preserve"> throws error</w:t>
+            </w:r>
           </w:p>
         </w:tc>
         <w:tc>
@@ -3493,12 +3789,21 @@
           </w:tcPr>
           <w:p>
             <w:pPr>
-              <w:rPr>
-                <w:rFonts w:ascii="Lora" w:hAnsi="Lora"/>
-                <w:sz w:val="18"/>
-                <w:szCs w:val="18"/>
-              </w:rPr>
-            </w:pPr>
+              <w:spacing w:line="276" w:lineRule="auto"/>
+              <w:rPr>
+                <w:rFonts w:ascii="Lora" w:hAnsi="Lora"/>
+                <w:sz w:val="16"/>
+                <w:szCs w:val="16"/>
+              </w:rPr>
+            </w:pPr>
+            <w:r>
+              <w:rPr>
+                <w:rFonts w:ascii="Lora" w:hAnsi="Lora"/>
+                <w:sz w:val="16"/>
+                <w:szCs w:val="16"/>
+              </w:rPr>
+              <w:t>Checkout still succeeds</w:t>
+            </w:r>
           </w:p>
         </w:tc>
         <w:tc>
@@ -3508,12 +3813,31 @@
           </w:tcPr>
           <w:p>
             <w:pPr>
-              <w:rPr>
-                <w:rFonts w:ascii="Lora" w:hAnsi="Lora"/>
-                <w:sz w:val="18"/>
-                <w:szCs w:val="18"/>
-              </w:rPr>
-            </w:pPr>
+              <w:spacing w:line="276" w:lineRule="auto"/>
+              <w:rPr>
+                <w:rFonts w:ascii="Lora" w:hAnsi="Lora"/>
+                <w:sz w:val="16"/>
+                <w:szCs w:val="16"/>
+              </w:rPr>
+            </w:pPr>
+            <w:proofErr w:type="spellStart"/>
+            <w:r>
+              <w:rPr>
+                <w:rFonts w:ascii="Lora" w:hAnsi="Lora"/>
+                <w:sz w:val="16"/>
+                <w:szCs w:val="16"/>
+              </w:rPr>
+              <w:t>UpdateTicketAsync</w:t>
+            </w:r>
+            <w:proofErr w:type="spellEnd"/>
+            <w:r>
+              <w:rPr>
+                <w:rFonts w:ascii="Lora" w:hAnsi="Lora"/>
+                <w:sz w:val="16"/>
+                <w:szCs w:val="16"/>
+              </w:rPr>
+              <w:t xml:space="preserve"> still called</w:t>
+            </w:r>
           </w:p>
         </w:tc>
       </w:tr>
@@ -3564,6 +3888,7 @@
         <w:tc>
           <w:tcPr>
             <w:tcW w:w="421" w:type="dxa"/>
+            <w:shd w:val="clear" w:color="auto" w:fill="FFF2CC" w:themeFill="accent4" w:themeFillTint="33"/>
             <w:vAlign w:val="center"/>
           </w:tcPr>
           <w:p>
@@ -3592,6 +3917,7 @@
         <w:tc>
           <w:tcPr>
             <w:tcW w:w="3260" w:type="dxa"/>
+            <w:shd w:val="clear" w:color="auto" w:fill="FFF2CC" w:themeFill="accent4" w:themeFillTint="33"/>
             <w:vAlign w:val="center"/>
           </w:tcPr>
           <w:p>
@@ -3619,6 +3945,7 @@
         <w:tc>
           <w:tcPr>
             <w:tcW w:w="3331" w:type="dxa"/>
+            <w:shd w:val="clear" w:color="auto" w:fill="FFF2CC" w:themeFill="accent4" w:themeFillTint="33"/>
             <w:vAlign w:val="center"/>
           </w:tcPr>
           <w:p>
@@ -3646,6 +3973,7 @@
         <w:tc>
           <w:tcPr>
             <w:tcW w:w="2338" w:type="dxa"/>
+            <w:shd w:val="clear" w:color="auto" w:fill="FFF2CC" w:themeFill="accent4" w:themeFillTint="33"/>
             <w:vAlign w:val="center"/>
           </w:tcPr>
           <w:p>
@@ -3678,6 +4006,7 @@
         <w:tc>
           <w:tcPr>
             <w:tcW w:w="421" w:type="dxa"/>
+            <w:shd w:val="clear" w:color="auto" w:fill="FFF2CC" w:themeFill="accent4" w:themeFillTint="33"/>
             <w:vAlign w:val="center"/>
           </w:tcPr>
           <w:p>
@@ -3710,17 +4039,18 @@
           </w:tcPr>
           <w:p>
             <w:pPr>
-              <w:rPr>
-                <w:rFonts w:ascii="Lora" w:hAnsi="Lora"/>
-                <w:sz w:val="18"/>
-                <w:szCs w:val="18"/>
-              </w:rPr>
-            </w:pPr>
-            <w:r>
-              <w:rPr>
-                <w:rFonts w:ascii="Lora" w:hAnsi="Lora"/>
-                <w:sz w:val="18"/>
-                <w:szCs w:val="18"/>
+              <w:spacing w:line="276" w:lineRule="auto"/>
+              <w:rPr>
+                <w:rFonts w:ascii="Lora" w:hAnsi="Lora"/>
+                <w:sz w:val="16"/>
+                <w:szCs w:val="16"/>
+              </w:rPr>
+            </w:pPr>
+            <w:r>
+              <w:rPr>
+                <w:rFonts w:ascii="Lora" w:hAnsi="Lora"/>
+                <w:sz w:val="16"/>
+                <w:szCs w:val="16"/>
               </w:rPr>
               <w:t>Full parking flow (car, 2 hours)</w:t>
             </w:r>
@@ -3733,18 +4063,19 @@
           </w:tcPr>
           <w:p>
             <w:pPr>
-              <w:rPr>
-                <w:rFonts w:ascii="Lora" w:hAnsi="Lora"/>
-                <w:sz w:val="18"/>
-                <w:szCs w:val="18"/>
+              <w:spacing w:line="276" w:lineRule="auto"/>
+              <w:rPr>
+                <w:rFonts w:ascii="Lora" w:hAnsi="Lora"/>
+                <w:sz w:val="16"/>
+                <w:szCs w:val="16"/>
               </w:rPr>
             </w:pPr>
             <w:proofErr w:type="spellStart"/>
             <w:r>
               <w:rPr>
                 <w:rFonts w:ascii="Lora" w:hAnsi="Lora"/>
-                <w:sz w:val="18"/>
-                <w:szCs w:val="18"/>
+                <w:sz w:val="16"/>
+                <w:szCs w:val="16"/>
               </w:rPr>
               <w:t>FeeCalculator</w:t>
             </w:r>
@@ -3752,8 +4083,8 @@
             <w:r>
               <w:rPr>
                 <w:rFonts w:ascii="Lora" w:hAnsi="Lora"/>
-                <w:sz w:val="18"/>
-                <w:szCs w:val="18"/>
+                <w:sz w:val="16"/>
+                <w:szCs w:val="16"/>
               </w:rPr>
               <w:t xml:space="preserve"> + </w:t>
             </w:r>
@@ -3761,8 +4092,8 @@
             <w:r>
               <w:rPr>
                 <w:rFonts w:ascii="Lora" w:hAnsi="Lora"/>
-                <w:sz w:val="18"/>
-                <w:szCs w:val="18"/>
+                <w:sz w:val="16"/>
+                <w:szCs w:val="16"/>
               </w:rPr>
               <w:t>InMemoryRepo</w:t>
             </w:r>
@@ -3770,8 +4101,8 @@
             <w:r>
               <w:rPr>
                 <w:rFonts w:ascii="Lora" w:hAnsi="Lora"/>
-                <w:sz w:val="18"/>
-                <w:szCs w:val="18"/>
+                <w:sz w:val="16"/>
+                <w:szCs w:val="16"/>
               </w:rPr>
               <w:t xml:space="preserve"> + </w:t>
             </w:r>
@@ -3779,8 +4110,8 @@
             <w:r>
               <w:rPr>
                 <w:rFonts w:ascii="Lora" w:hAnsi="Lora"/>
-                <w:sz w:val="18"/>
-                <w:szCs w:val="18"/>
+                <w:sz w:val="16"/>
+                <w:szCs w:val="16"/>
               </w:rPr>
               <w:t>SessionManager</w:t>
             </w:r>
@@ -3794,19 +4125,74 @@
           </w:tcPr>
           <w:p>
             <w:pPr>
-              <w:rPr>
-                <w:rFonts w:ascii="Lora" w:hAnsi="Lora"/>
-                <w:sz w:val="18"/>
-                <w:szCs w:val="18"/>
-              </w:rPr>
-            </w:pPr>
-            <w:r>
-              <w:rPr>
-                <w:rFonts w:ascii="Lora" w:hAnsi="Lora"/>
-                <w:sz w:val="18"/>
-                <w:szCs w:val="18"/>
-              </w:rPr>
-              <w:t>Fee = 2,000 KHR, ticket marked as checked out</w:t>
+              <w:spacing w:line="276" w:lineRule="auto"/>
+              <w:rPr>
+                <w:rFonts w:ascii="Lora" w:hAnsi="Lora"/>
+                <w:sz w:val="16"/>
+                <w:szCs w:val="16"/>
+              </w:rPr>
+            </w:pPr>
+            <w:r>
+              <w:rPr>
+                <w:rFonts w:ascii="Lora" w:hAnsi="Lora"/>
+                <w:sz w:val="16"/>
+                <w:szCs w:val="16"/>
+              </w:rPr>
+              <w:t xml:space="preserve">Fee = </w:t>
+            </w:r>
+            <w:r>
+              <w:rPr>
+                <w:rStyle w:val="Strong"/>
+                <w:rFonts w:ascii="Lora" w:hAnsi="Lora"/>
+                <w:b w:val="0"/>
+                <w:bCs w:val="0"/>
+                <w:sz w:val="16"/>
+                <w:szCs w:val="16"/>
+              </w:rPr>
+              <w:t>2,000 KHR</w:t>
+            </w:r>
+            <w:r>
+              <w:rPr>
+                <w:rFonts w:ascii="Lora" w:hAnsi="Lora"/>
+                <w:sz w:val="16"/>
+                <w:szCs w:val="16"/>
+              </w:rPr>
+              <w:t xml:space="preserve">, ticket marked as </w:t>
+            </w:r>
+            <w:r>
+              <w:rPr>
+                <w:rStyle w:val="Strong"/>
+                <w:rFonts w:ascii="Lora" w:hAnsi="Lora"/>
+                <w:b w:val="0"/>
+                <w:bCs w:val="0"/>
+                <w:sz w:val="16"/>
+                <w:szCs w:val="16"/>
+              </w:rPr>
+              <w:t>completed (</w:t>
+            </w:r>
+            <w:proofErr w:type="spellStart"/>
+            <w:r>
+              <w:rPr>
+                <w:rStyle w:val="Strong"/>
+                <w:rFonts w:ascii="Lora" w:hAnsi="Lora"/>
+                <w:b w:val="0"/>
+                <w:bCs w:val="0"/>
+                <w:sz w:val="16"/>
+                <w:szCs w:val="16"/>
+              </w:rPr>
+              <w:t>IsActive</w:t>
+            </w:r>
+            <w:proofErr w:type="spellEnd"/>
+            <w:r>
+              <w:rPr>
+                <w:rStyle w:val="Strong"/>
+                <w:rFonts w:ascii="Lora" w:hAnsi="Lora"/>
+                <w:b w:val="0"/>
+                <w:bCs w:val="0"/>
+                <w:sz w:val="16"/>
+                <w:szCs w:val="16"/>
+              </w:rPr>
+              <w:t xml:space="preserve"> = false)</w:t>
             </w:r>
           </w:p>
         </w:tc>
@@ -3818,6 +4204,7 @@
         <w:tc>
           <w:tcPr>
             <w:tcW w:w="421" w:type="dxa"/>
+            <w:shd w:val="clear" w:color="auto" w:fill="FFF2CC" w:themeFill="accent4" w:themeFillTint="33"/>
             <w:vAlign w:val="center"/>
           </w:tcPr>
           <w:p>
@@ -3850,12 +4237,21 @@
           </w:tcPr>
           <w:p>
             <w:pPr>
-              <w:rPr>
-                <w:rFonts w:ascii="Lora" w:hAnsi="Lora"/>
-                <w:sz w:val="20"/>
-                <w:szCs w:val="20"/>
-              </w:rPr>
-            </w:pPr>
+              <w:spacing w:line="276" w:lineRule="auto"/>
+              <w:rPr>
+                <w:rFonts w:ascii="Lora" w:hAnsi="Lora"/>
+                <w:sz w:val="16"/>
+                <w:szCs w:val="16"/>
+              </w:rPr>
+            </w:pPr>
+            <w:r>
+              <w:rPr>
+                <w:rFonts w:ascii="Lora" w:hAnsi="Lora"/>
+                <w:sz w:val="16"/>
+                <w:szCs w:val="16"/>
+              </w:rPr>
+              <w:t>Grace period flow (Car, 20 minutes)</w:t>
+            </w:r>
           </w:p>
         </w:tc>
         <w:tc>
@@ -3865,12 +4261,59 @@
           </w:tcPr>
           <w:p>
             <w:pPr>
-              <w:rPr>
-                <w:rFonts w:ascii="Lora" w:hAnsi="Lora"/>
-                <w:sz w:val="20"/>
-                <w:szCs w:val="20"/>
-              </w:rPr>
-            </w:pPr>
+              <w:spacing w:line="276" w:lineRule="auto"/>
+              <w:rPr>
+                <w:rFonts w:ascii="Lora" w:hAnsi="Lora"/>
+                <w:sz w:val="16"/>
+                <w:szCs w:val="16"/>
+              </w:rPr>
+            </w:pPr>
+            <w:proofErr w:type="spellStart"/>
+            <w:r>
+              <w:rPr>
+                <w:rFonts w:ascii="Lora" w:hAnsi="Lora"/>
+                <w:sz w:val="16"/>
+                <w:szCs w:val="16"/>
+              </w:rPr>
+              <w:t>FeeCalculator</w:t>
+            </w:r>
+            <w:proofErr w:type="spellEnd"/>
+            <w:r>
+              <w:rPr>
+                <w:rFonts w:ascii="Lora" w:hAnsi="Lora"/>
+                <w:sz w:val="16"/>
+                <w:szCs w:val="16"/>
+              </w:rPr>
+              <w:t xml:space="preserve"> + </w:t>
+            </w:r>
+            <w:proofErr w:type="spellStart"/>
+            <w:r>
+              <w:rPr>
+                <w:rFonts w:ascii="Lora" w:hAnsi="Lora"/>
+                <w:sz w:val="16"/>
+                <w:szCs w:val="16"/>
+              </w:rPr>
+              <w:t>InMemoryRepository</w:t>
+            </w:r>
+            <w:proofErr w:type="spellEnd"/>
+            <w:r>
+              <w:rPr>
+                <w:rFonts w:ascii="Lora" w:hAnsi="Lora"/>
+                <w:sz w:val="16"/>
+                <w:szCs w:val="16"/>
+              </w:rPr>
+              <w:t xml:space="preserve"> + </w:t>
+            </w:r>
+            <w:proofErr w:type="spellStart"/>
+            <w:r>
+              <w:rPr>
+                <w:rFonts w:ascii="Lora" w:hAnsi="Lora"/>
+                <w:sz w:val="16"/>
+                <w:szCs w:val="16"/>
+              </w:rPr>
+              <w:t>SessionManager</w:t>
+            </w:r>
+            <w:proofErr w:type="spellEnd"/>
           </w:p>
         </w:tc>
         <w:tc>
@@ -3880,12 +4323,40 @@
           </w:tcPr>
           <w:p>
             <w:pPr>
-              <w:rPr>
-                <w:rFonts w:ascii="Lora" w:hAnsi="Lora"/>
-                <w:sz w:val="20"/>
-                <w:szCs w:val="20"/>
-              </w:rPr>
-            </w:pPr>
+              <w:spacing w:line="276" w:lineRule="auto"/>
+              <w:rPr>
+                <w:rFonts w:ascii="Lora" w:hAnsi="Lora"/>
+                <w:sz w:val="16"/>
+                <w:szCs w:val="16"/>
+              </w:rPr>
+            </w:pPr>
+            <w:r>
+              <w:rPr>
+                <w:rFonts w:ascii="Lora" w:hAnsi="Lora"/>
+                <w:sz w:val="16"/>
+                <w:szCs w:val="16"/>
+              </w:rPr>
+              <w:t xml:space="preserve">Fee = </w:t>
+            </w:r>
+            <w:r>
+              <w:rPr>
+                <w:rStyle w:val="Strong"/>
+                <w:rFonts w:ascii="Lora" w:hAnsi="Lora"/>
+                <w:b w:val="0"/>
+                <w:bCs w:val="0"/>
+                <w:sz w:val="16"/>
+                <w:szCs w:val="16"/>
+              </w:rPr>
+              <w:t>0 KHR</w:t>
+            </w:r>
+            <w:r>
+              <w:rPr>
+                <w:rFonts w:ascii="Lora" w:hAnsi="Lora"/>
+                <w:sz w:val="16"/>
+                <w:szCs w:val="16"/>
+              </w:rPr>
+              <w:t>, no charge applied, ticket closed successfully</w:t>
+            </w:r>
           </w:p>
         </w:tc>
       </w:tr>
@@ -3896,6 +4367,7 @@
         <w:tc>
           <w:tcPr>
             <w:tcW w:w="421" w:type="dxa"/>
+            <w:shd w:val="clear" w:color="auto" w:fill="FFF2CC" w:themeFill="accent4" w:themeFillTint="33"/>
             <w:vAlign w:val="center"/>
           </w:tcPr>
           <w:p>
@@ -3928,12 +4400,21 @@
           </w:tcPr>
           <w:p>
             <w:pPr>
-              <w:rPr>
-                <w:rFonts w:ascii="Lora" w:hAnsi="Lora"/>
-                <w:sz w:val="20"/>
-                <w:szCs w:val="20"/>
-              </w:rPr>
-            </w:pPr>
+              <w:spacing w:line="276" w:lineRule="auto"/>
+              <w:rPr>
+                <w:rFonts w:ascii="Lora" w:hAnsi="Lora"/>
+                <w:sz w:val="16"/>
+                <w:szCs w:val="16"/>
+              </w:rPr>
+            </w:pPr>
+            <w:r>
+              <w:rPr>
+                <w:rFonts w:ascii="Lora" w:hAnsi="Lora"/>
+                <w:sz w:val="16"/>
+                <w:szCs w:val="16"/>
+              </w:rPr>
+              <w:t>Lost ticket scenario (Car, 1 hour)</w:t>
+            </w:r>
           </w:p>
         </w:tc>
         <w:tc>
@@ -3943,12 +4424,59 @@
           </w:tcPr>
           <w:p>
             <w:pPr>
-              <w:rPr>
-                <w:rFonts w:ascii="Lora" w:hAnsi="Lora"/>
-                <w:sz w:val="20"/>
-                <w:szCs w:val="20"/>
-              </w:rPr>
-            </w:pPr>
+              <w:spacing w:line="276" w:lineRule="auto"/>
+              <w:rPr>
+                <w:rFonts w:ascii="Lora" w:hAnsi="Lora"/>
+                <w:sz w:val="16"/>
+                <w:szCs w:val="16"/>
+              </w:rPr>
+            </w:pPr>
+            <w:proofErr w:type="spellStart"/>
+            <w:r>
+              <w:rPr>
+                <w:rFonts w:ascii="Lora" w:hAnsi="Lora"/>
+                <w:sz w:val="16"/>
+                <w:szCs w:val="16"/>
+              </w:rPr>
+              <w:t>FeeCalculator</w:t>
+            </w:r>
+            <w:proofErr w:type="spellEnd"/>
+            <w:r>
+              <w:rPr>
+                <w:rFonts w:ascii="Lora" w:hAnsi="Lora"/>
+                <w:sz w:val="16"/>
+                <w:szCs w:val="16"/>
+              </w:rPr>
+              <w:t xml:space="preserve"> + </w:t>
+            </w:r>
+            <w:proofErr w:type="spellStart"/>
+            <w:r>
+              <w:rPr>
+                <w:rFonts w:ascii="Lora" w:hAnsi="Lora"/>
+                <w:sz w:val="16"/>
+                <w:szCs w:val="16"/>
+              </w:rPr>
+              <w:t>InMemoryRepository</w:t>
+            </w:r>
+            <w:proofErr w:type="spellEnd"/>
+            <w:r>
+              <w:rPr>
+                <w:rFonts w:ascii="Lora" w:hAnsi="Lora"/>
+                <w:sz w:val="16"/>
+                <w:szCs w:val="16"/>
+              </w:rPr>
+              <w:t xml:space="preserve"> + </w:t>
+            </w:r>
+            <w:proofErr w:type="spellStart"/>
+            <w:r>
+              <w:rPr>
+                <w:rFonts w:ascii="Lora" w:hAnsi="Lora"/>
+                <w:sz w:val="16"/>
+                <w:szCs w:val="16"/>
+              </w:rPr>
+              <w:t>SessionManager</w:t>
+            </w:r>
+            <w:proofErr w:type="spellEnd"/>
           </w:p>
         </w:tc>
         <w:tc>
@@ -3958,12 +4486,50 @@
           </w:tcPr>
           <w:p>
             <w:pPr>
-              <w:rPr>
-                <w:rFonts w:ascii="Lora" w:hAnsi="Lora"/>
-                <w:sz w:val="20"/>
-                <w:szCs w:val="20"/>
-              </w:rPr>
-            </w:pPr>
+              <w:spacing w:line="276" w:lineRule="auto"/>
+              <w:rPr>
+                <w:rFonts w:ascii="Lora" w:hAnsi="Lora"/>
+                <w:sz w:val="16"/>
+                <w:szCs w:val="16"/>
+              </w:rPr>
+            </w:pPr>
+            <w:r>
+              <w:rPr>
+                <w:rFonts w:ascii="Lora" w:hAnsi="Lora"/>
+                <w:sz w:val="16"/>
+                <w:szCs w:val="16"/>
+              </w:rPr>
+              <w:t xml:space="preserve">Fee = </w:t>
+            </w:r>
+            <w:r>
+              <w:rPr>
+                <w:rStyle w:val="Strong"/>
+                <w:rFonts w:ascii="Lora" w:hAnsi="Lora"/>
+                <w:b w:val="0"/>
+                <w:bCs w:val="0"/>
+                <w:sz w:val="16"/>
+                <w:szCs w:val="16"/>
+              </w:rPr>
+              <w:t>21,000 KHR</w:t>
+            </w:r>
+            <w:r>
+              <w:rPr>
+                <w:rFonts w:ascii="Lora" w:hAnsi="Lora"/>
+                <w:b/>
+                <w:bCs/>
+                <w:sz w:val="16"/>
+                <w:szCs w:val="16"/>
+              </w:rPr>
+              <w:t xml:space="preserve"> </w:t>
+            </w:r>
+            <w:r>
+              <w:rPr>
+                <w:rFonts w:ascii="Lora" w:hAnsi="Lora"/>
+                <w:sz w:val="16"/>
+                <w:szCs w:val="16"/>
+              </w:rPr>
+              <w:t>(1,000 base + 20,000 penalty), ticket completed</w:t>
+            </w:r>
           </w:p>
         </w:tc>
       </w:tr>
@@ -3974,6 +4540,7 @@
         <w:tc>
           <w:tcPr>
             <w:tcW w:w="421" w:type="dxa"/>
+            <w:shd w:val="clear" w:color="auto" w:fill="FFF2CC" w:themeFill="accent4" w:themeFillTint="33"/>
             <w:vAlign w:val="center"/>
           </w:tcPr>
           <w:p>
@@ -4006,12 +4573,21 @@
           </w:tcPr>
           <w:p>
             <w:pPr>
-              <w:rPr>
-                <w:rFonts w:ascii="Lora" w:hAnsi="Lora"/>
-                <w:sz w:val="20"/>
-                <w:szCs w:val="20"/>
-              </w:rPr>
-            </w:pPr>
+              <w:spacing w:line="276" w:lineRule="auto"/>
+              <w:rPr>
+                <w:rFonts w:ascii="Lora" w:hAnsi="Lora"/>
+                <w:sz w:val="16"/>
+                <w:szCs w:val="16"/>
+              </w:rPr>
+            </w:pPr>
+            <w:r>
+              <w:rPr>
+                <w:rFonts w:ascii="Lora" w:hAnsi="Lora"/>
+                <w:sz w:val="16"/>
+                <w:szCs w:val="16"/>
+              </w:rPr>
+              <w:t>Weekend surcharge (Car, 2 hours on Saturday)</w:t>
+            </w:r>
           </w:p>
         </w:tc>
         <w:tc>
@@ -4021,12 +4597,59 @@
           </w:tcPr>
           <w:p>
             <w:pPr>
-              <w:rPr>
-                <w:rFonts w:ascii="Lora" w:hAnsi="Lora"/>
-                <w:sz w:val="20"/>
-                <w:szCs w:val="20"/>
-              </w:rPr>
-            </w:pPr>
+              <w:spacing w:line="276" w:lineRule="auto"/>
+              <w:rPr>
+                <w:rFonts w:ascii="Lora" w:hAnsi="Lora"/>
+                <w:sz w:val="16"/>
+                <w:szCs w:val="16"/>
+              </w:rPr>
+            </w:pPr>
+            <w:proofErr w:type="spellStart"/>
+            <w:r>
+              <w:rPr>
+                <w:rFonts w:ascii="Lora" w:hAnsi="Lora"/>
+                <w:sz w:val="16"/>
+                <w:szCs w:val="16"/>
+              </w:rPr>
+              <w:t>FeeCalculator</w:t>
+            </w:r>
+            <w:proofErr w:type="spellEnd"/>
+            <w:r>
+              <w:rPr>
+                <w:rFonts w:ascii="Lora" w:hAnsi="Lora"/>
+                <w:sz w:val="16"/>
+                <w:szCs w:val="16"/>
+              </w:rPr>
+              <w:t xml:space="preserve"> + </w:t>
+            </w:r>
+            <w:proofErr w:type="spellStart"/>
+            <w:r>
+              <w:rPr>
+                <w:rFonts w:ascii="Lora" w:hAnsi="Lora"/>
+                <w:sz w:val="16"/>
+                <w:szCs w:val="16"/>
+              </w:rPr>
+              <w:t>InMemoryRepository</w:t>
+            </w:r>
+            <w:proofErr w:type="spellEnd"/>
+            <w:r>
+              <w:rPr>
+                <w:rFonts w:ascii="Lora" w:hAnsi="Lora"/>
+                <w:sz w:val="16"/>
+                <w:szCs w:val="16"/>
+              </w:rPr>
+              <w:t xml:space="preserve"> + </w:t>
+            </w:r>
+            <w:proofErr w:type="spellStart"/>
+            <w:r>
+              <w:rPr>
+                <w:rFonts w:ascii="Lora" w:hAnsi="Lora"/>
+                <w:sz w:val="16"/>
+                <w:szCs w:val="16"/>
+              </w:rPr>
+              <w:t>SessionManager</w:t>
+            </w:r>
+            <w:proofErr w:type="spellEnd"/>
           </w:p>
         </w:tc>
         <w:tc>
@@ -4036,12 +4659,40 @@
           </w:tcPr>
           <w:p>
             <w:pPr>
-              <w:rPr>
-                <w:rFonts w:ascii="Lora" w:hAnsi="Lora"/>
-                <w:sz w:val="20"/>
-                <w:szCs w:val="20"/>
-              </w:rPr>
-            </w:pPr>
+              <w:spacing w:line="276" w:lineRule="auto"/>
+              <w:rPr>
+                <w:rFonts w:ascii="Lora" w:hAnsi="Lora"/>
+                <w:sz w:val="16"/>
+                <w:szCs w:val="16"/>
+              </w:rPr>
+            </w:pPr>
+            <w:r>
+              <w:rPr>
+                <w:rFonts w:ascii="Lora" w:hAnsi="Lora"/>
+                <w:sz w:val="16"/>
+                <w:szCs w:val="16"/>
+              </w:rPr>
+              <w:t xml:space="preserve">Fee = </w:t>
+            </w:r>
+            <w:r>
+              <w:rPr>
+                <w:rStyle w:val="Strong"/>
+                <w:rFonts w:ascii="Lora" w:hAnsi="Lora"/>
+                <w:b w:val="0"/>
+                <w:bCs w:val="0"/>
+                <w:sz w:val="16"/>
+                <w:szCs w:val="16"/>
+              </w:rPr>
+              <w:t>2,400 KHR</w:t>
+            </w:r>
+            <w:r>
+              <w:rPr>
+                <w:rFonts w:ascii="Lora" w:hAnsi="Lora"/>
+                <w:sz w:val="16"/>
+                <w:szCs w:val="16"/>
+              </w:rPr>
+              <w:t xml:space="preserve"> (2,000 + 20% surcharge), ticket completed</w:t>
+            </w:r>
           </w:p>
         </w:tc>
       </w:tr>
@@ -4052,6 +4703,7 @@
         <w:tc>
           <w:tcPr>
             <w:tcW w:w="421" w:type="dxa"/>
+            <w:shd w:val="clear" w:color="auto" w:fill="FFF2CC" w:themeFill="accent4" w:themeFillTint="33"/>
             <w:vAlign w:val="center"/>
           </w:tcPr>
           <w:p>
@@ -4084,12 +4736,21 @@
           </w:tcPr>
           <w:p>
             <w:pPr>
-              <w:rPr>
-                <w:rFonts w:ascii="Lora" w:hAnsi="Lora"/>
-                <w:sz w:val="20"/>
-                <w:szCs w:val="20"/>
-              </w:rPr>
-            </w:pPr>
+              <w:spacing w:line="276" w:lineRule="auto"/>
+              <w:rPr>
+                <w:rFonts w:ascii="Lora" w:hAnsi="Lora"/>
+                <w:sz w:val="16"/>
+                <w:szCs w:val="16"/>
+              </w:rPr>
+            </w:pPr>
+            <w:r>
+              <w:rPr>
+                <w:rFonts w:ascii="Lora" w:hAnsi="Lora"/>
+                <w:sz w:val="16"/>
+                <w:szCs w:val="16"/>
+              </w:rPr>
+              <w:t>Notification failure during checkout using</w:t>
+            </w:r>
           </w:p>
         </w:tc>
         <w:tc>
@@ -4099,12 +4760,85 @@
           </w:tcPr>
           <w:p>
             <w:pPr>
-              <w:rPr>
-                <w:rFonts w:ascii="Lora" w:hAnsi="Lora"/>
-                <w:sz w:val="20"/>
-                <w:szCs w:val="20"/>
-              </w:rPr>
-            </w:pPr>
+              <w:spacing w:line="276" w:lineRule="auto"/>
+              <w:rPr>
+                <w:rFonts w:ascii="Lora" w:hAnsi="Lora"/>
+                <w:sz w:val="16"/>
+                <w:szCs w:val="16"/>
+              </w:rPr>
+            </w:pPr>
+            <w:proofErr w:type="spellStart"/>
+            <w:r>
+              <w:rPr>
+                <w:rFonts w:ascii="Lora" w:hAnsi="Lora"/>
+                <w:sz w:val="16"/>
+                <w:szCs w:val="16"/>
+              </w:rPr>
+              <w:t>FeeCalculator</w:t>
+            </w:r>
+            <w:proofErr w:type="spellEnd"/>
+            <w:r>
+              <w:rPr>
+                <w:rFonts w:ascii="Lora" w:hAnsi="Lora"/>
+                <w:sz w:val="16"/>
+                <w:szCs w:val="16"/>
+              </w:rPr>
+              <w:t xml:space="preserve"> + </w:t>
+            </w:r>
+            <w:proofErr w:type="spellStart"/>
+            <w:r>
+              <w:rPr>
+                <w:rFonts w:ascii="Lora" w:hAnsi="Lora"/>
+                <w:sz w:val="16"/>
+                <w:szCs w:val="16"/>
+              </w:rPr>
+              <w:t>InMemoryRepository</w:t>
+            </w:r>
+            <w:proofErr w:type="spellEnd"/>
+            <w:r>
+              <w:rPr>
+                <w:rFonts w:ascii="Lora" w:hAnsi="Lora"/>
+                <w:sz w:val="16"/>
+                <w:szCs w:val="16"/>
+              </w:rPr>
+              <w:t xml:space="preserve"> + </w:t>
+            </w:r>
+            <w:proofErr w:type="spellStart"/>
+            <w:r>
+              <w:rPr>
+                <w:rFonts w:ascii="Lora" w:hAnsi="Lora"/>
+                <w:sz w:val="16"/>
+                <w:szCs w:val="16"/>
+              </w:rPr>
+              <w:t>SessionManager</w:t>
+            </w:r>
+            <w:proofErr w:type="spellEnd"/>
+            <w:r>
+              <w:rPr>
+                <w:rFonts w:ascii="Lora" w:hAnsi="Lora"/>
+                <w:sz w:val="16"/>
+                <w:szCs w:val="16"/>
+              </w:rPr>
+              <w:t xml:space="preserve"> + </w:t>
+            </w:r>
+            <w:proofErr w:type="spellStart"/>
+            <w:r>
+              <w:rPr>
+                <w:rFonts w:ascii="Lora" w:hAnsi="Lora"/>
+                <w:sz w:val="16"/>
+                <w:szCs w:val="16"/>
+              </w:rPr>
+              <w:t>NotificationService</w:t>
+            </w:r>
+            <w:proofErr w:type="spellEnd"/>
+            <w:r>
+              <w:rPr>
+                <w:rFonts w:ascii="Lora" w:hAnsi="Lora"/>
+                <w:sz w:val="16"/>
+                <w:szCs w:val="16"/>
+              </w:rPr>
+              <w:t xml:space="preserve"> mock failure</w:t>
+            </w:r>
           </w:p>
         </w:tc>
         <w:tc>
@@ -4114,12 +4848,40 @@
           </w:tcPr>
           <w:p>
             <w:pPr>
-              <w:rPr>
-                <w:rFonts w:ascii="Lora" w:hAnsi="Lora"/>
-                <w:sz w:val="20"/>
-                <w:szCs w:val="20"/>
-              </w:rPr>
-            </w:pPr>
+              <w:spacing w:line="276" w:lineRule="auto"/>
+              <w:rPr>
+                <w:rFonts w:ascii="Lora" w:hAnsi="Lora"/>
+                <w:sz w:val="16"/>
+                <w:szCs w:val="16"/>
+              </w:rPr>
+            </w:pPr>
+            <w:r>
+              <w:rPr>
+                <w:rFonts w:ascii="Lora" w:hAnsi="Lora"/>
+                <w:sz w:val="16"/>
+                <w:szCs w:val="16"/>
+              </w:rPr>
+              <w:t xml:space="preserve">Checkout still succeeds, fee = </w:t>
+            </w:r>
+            <w:r>
+              <w:rPr>
+                <w:rStyle w:val="Strong"/>
+                <w:rFonts w:ascii="Lora" w:hAnsi="Lora"/>
+                <w:b w:val="0"/>
+                <w:bCs w:val="0"/>
+                <w:sz w:val="16"/>
+                <w:szCs w:val="16"/>
+              </w:rPr>
+              <w:t>2,000 KHR</w:t>
+            </w:r>
+            <w:r>
+              <w:rPr>
+                <w:rFonts w:ascii="Lora" w:hAnsi="Lora"/>
+                <w:sz w:val="16"/>
+                <w:szCs w:val="16"/>
+              </w:rPr>
+              <w:t>, ticket still marked completed (notification failure ignored)</w:t>
+            </w:r>
           </w:p>
         </w:tc>
       </w:tr>
@@ -4200,6 +4962,7 @@
         <w:tc>
           <w:tcPr>
             <w:tcW w:w="421" w:type="dxa"/>
+            <w:shd w:val="clear" w:color="auto" w:fill="FBE4D5" w:themeFill="accent2" w:themeFillTint="33"/>
             <w:vAlign w:val="center"/>
           </w:tcPr>
           <w:p>
@@ -4228,6 +4991,7 @@
         <w:tc>
           <w:tcPr>
             <w:tcW w:w="4252" w:type="dxa"/>
+            <w:shd w:val="clear" w:color="auto" w:fill="FBE4D5" w:themeFill="accent2" w:themeFillTint="33"/>
             <w:vAlign w:val="center"/>
           </w:tcPr>
           <w:p>
@@ -4255,6 +5019,7 @@
         <w:tc>
           <w:tcPr>
             <w:tcW w:w="4677" w:type="dxa"/>
+            <w:shd w:val="clear" w:color="auto" w:fill="FBE4D5" w:themeFill="accent2" w:themeFillTint="33"/>
             <w:vAlign w:val="center"/>
           </w:tcPr>
           <w:p>
@@ -4287,6 +5052,7 @@
         <w:tc>
           <w:tcPr>
             <w:tcW w:w="421" w:type="dxa"/>
+            <w:shd w:val="clear" w:color="auto" w:fill="FBE4D5" w:themeFill="accent2" w:themeFillTint="33"/>
             <w:vAlign w:val="center"/>
           </w:tcPr>
           <w:p>
@@ -4321,15 +5087,15 @@
             <w:pPr>
               <w:rPr>
                 <w:rFonts w:ascii="Lora" w:hAnsi="Lora"/>
-                <w:sz w:val="18"/>
-                <w:szCs w:val="18"/>
-              </w:rPr>
-            </w:pPr>
-            <w:r>
-              <w:rPr>
-                <w:rFonts w:ascii="Lora" w:hAnsi="Lora"/>
-                <w:sz w:val="18"/>
-                <w:szCs w:val="18"/>
+                <w:sz w:val="16"/>
+                <w:szCs w:val="16"/>
+              </w:rPr>
+            </w:pPr>
+            <w:r>
+              <w:rPr>
+                <w:rFonts w:ascii="Lora" w:hAnsi="Lora"/>
+                <w:sz w:val="16"/>
+                <w:szCs w:val="16"/>
               </w:rPr>
               <w:t>Fee is never negative</w:t>
             </w:r>
@@ -4342,19 +5108,20 @@
           </w:tcPr>
           <w:p>
             <w:pPr>
-              <w:rPr>
-                <w:rFonts w:ascii="Lora" w:hAnsi="Lora"/>
-                <w:sz w:val="18"/>
-                <w:szCs w:val="18"/>
-              </w:rPr>
-            </w:pPr>
-            <w:r>
-              <w:rPr>
-                <w:rFonts w:ascii="Lora" w:hAnsi="Lora"/>
-                <w:sz w:val="18"/>
-                <w:szCs w:val="18"/>
-              </w:rPr>
-              <w:t>A parking fee cannot be negative because you cannot owe a customer money for parking.</w:t>
+              <w:spacing w:line="276" w:lineRule="auto"/>
+              <w:rPr>
+                <w:rFonts w:ascii="Lora" w:hAnsi="Lora"/>
+                <w:sz w:val="16"/>
+                <w:szCs w:val="16"/>
+              </w:rPr>
+            </w:pPr>
+            <w:r>
+              <w:rPr>
+                <w:rFonts w:ascii="Lora" w:hAnsi="Lora"/>
+                <w:sz w:val="16"/>
+                <w:szCs w:val="16"/>
+              </w:rPr>
+              <w:t>A parking fee can never be less than 0 because the system should not give money to users.</w:t>
             </w:r>
           </w:p>
         </w:tc>
@@ -4366,6 +5133,7 @@
         <w:tc>
           <w:tcPr>
             <w:tcW w:w="421" w:type="dxa"/>
+            <w:shd w:val="clear" w:color="auto" w:fill="FBE4D5" w:themeFill="accent2" w:themeFillTint="33"/>
             <w:vAlign w:val="center"/>
           </w:tcPr>
           <w:p>
@@ -4400,15 +5168,15 @@
             <w:pPr>
               <w:rPr>
                 <w:rFonts w:ascii="Lora" w:hAnsi="Lora"/>
-                <w:sz w:val="18"/>
-                <w:szCs w:val="18"/>
-              </w:rPr>
-            </w:pPr>
-            <w:r>
-              <w:rPr>
-                <w:rFonts w:ascii="Lora" w:hAnsi="Lora"/>
-                <w:sz w:val="18"/>
-                <w:szCs w:val="18"/>
+                <w:sz w:val="16"/>
+                <w:szCs w:val="16"/>
+              </w:rPr>
+            </w:pPr>
+            <w:r>
+              <w:rPr>
+                <w:rFonts w:ascii="Lora" w:hAnsi="Lora"/>
+                <w:sz w:val="16"/>
+                <w:szCs w:val="16"/>
               </w:rPr>
               <w:t>Grace period is always free</w:t>
             </w:r>
@@ -4421,19 +5189,20 @@
           </w:tcPr>
           <w:p>
             <w:pPr>
-              <w:rPr>
-                <w:rFonts w:ascii="Lora" w:hAnsi="Lora"/>
-                <w:sz w:val="18"/>
-                <w:szCs w:val="18"/>
-              </w:rPr>
-            </w:pPr>
-            <w:r>
-              <w:rPr>
-                <w:rFonts w:ascii="Lora" w:hAnsi="Lora"/>
-                <w:sz w:val="18"/>
-                <w:szCs w:val="18"/>
-              </w:rPr>
-              <w:t>The business rule says parking ≤30 min costs 0 KHR, regardless of vehicle type or membership.</w:t>
+              <w:spacing w:line="276" w:lineRule="auto"/>
+              <w:rPr>
+                <w:rFonts w:ascii="Lora" w:hAnsi="Lora"/>
+                <w:sz w:val="16"/>
+                <w:szCs w:val="16"/>
+              </w:rPr>
+            </w:pPr>
+            <w:r>
+              <w:rPr>
+                <w:rFonts w:ascii="Lora" w:hAnsi="Lora"/>
+                <w:sz w:val="16"/>
+                <w:szCs w:val="16"/>
+              </w:rPr>
+              <w:t>If parking time is within the free grace period (e.g., 30 minutes), the fee must always be 0 no matter the vehicle type or membership.</w:t>
             </w:r>
           </w:p>
         </w:tc>
@@ -4445,6 +5214,7 @@
         <w:tc>
           <w:tcPr>
             <w:tcW w:w="421" w:type="dxa"/>
+            <w:shd w:val="clear" w:color="auto" w:fill="FBE4D5" w:themeFill="accent2" w:themeFillTint="33"/>
             <w:vAlign w:val="center"/>
           </w:tcPr>
           <w:p>
@@ -4479,10 +5249,18 @@
             <w:pPr>
               <w:rPr>
                 <w:rFonts w:ascii="Lora" w:hAnsi="Lora"/>
-                <w:sz w:val="20"/>
-                <w:szCs w:val="20"/>
-              </w:rPr>
-            </w:pPr>
+                <w:sz w:val="16"/>
+                <w:szCs w:val="16"/>
+              </w:rPr>
+            </w:pPr>
+            <w:r>
+              <w:rPr>
+                <w:rFonts w:ascii="Lora" w:hAnsi="Lora"/>
+                <w:sz w:val="16"/>
+                <w:szCs w:val="16"/>
+              </w:rPr>
+              <w:t>Same time check-in and check-out gives 0 fee</w:t>
+            </w:r>
           </w:p>
         </w:tc>
         <w:tc>
@@ -4492,12 +5270,21 @@
           </w:tcPr>
           <w:p>
             <w:pPr>
-              <w:rPr>
-                <w:rFonts w:ascii="Lora" w:hAnsi="Lora"/>
-                <w:sz w:val="20"/>
-                <w:szCs w:val="20"/>
-              </w:rPr>
-            </w:pPr>
+              <w:spacing w:line="276" w:lineRule="auto"/>
+              <w:rPr>
+                <w:rFonts w:ascii="Lora" w:hAnsi="Lora"/>
+                <w:sz w:val="16"/>
+                <w:szCs w:val="16"/>
+              </w:rPr>
+            </w:pPr>
+            <w:r>
+              <w:rPr>
+                <w:rFonts w:ascii="Lora" w:hAnsi="Lora"/>
+                <w:sz w:val="16"/>
+                <w:szCs w:val="16"/>
+              </w:rPr>
+              <w:t>If a user checks in and out at the same time, there is no parking time, so the fee must always be 0.</w:t>
+            </w:r>
           </w:p>
         </w:tc>
       </w:tr>
@@ -4508,6 +5295,7 @@
         <w:tc>
           <w:tcPr>
             <w:tcW w:w="421" w:type="dxa"/>
+            <w:shd w:val="clear" w:color="auto" w:fill="FBE4D5" w:themeFill="accent2" w:themeFillTint="33"/>
             <w:vAlign w:val="center"/>
           </w:tcPr>
           <w:p>
@@ -4542,10 +5330,18 @@
             <w:pPr>
               <w:rPr>
                 <w:rFonts w:ascii="Lora" w:hAnsi="Lora"/>
-                <w:sz w:val="20"/>
-                <w:szCs w:val="20"/>
-              </w:rPr>
-            </w:pPr>
+                <w:sz w:val="16"/>
+                <w:szCs w:val="16"/>
+              </w:rPr>
+            </w:pPr>
+            <w:r>
+              <w:rPr>
+                <w:rFonts w:ascii="Lora" w:hAnsi="Lora"/>
+                <w:sz w:val="16"/>
+                <w:szCs w:val="16"/>
+              </w:rPr>
+              <w:t>Longer parking time never reduces fee</w:t>
+            </w:r>
           </w:p>
         </w:tc>
         <w:tc>
@@ -4555,12 +5351,21 @@
           </w:tcPr>
           <w:p>
             <w:pPr>
-              <w:rPr>
-                <w:rFonts w:ascii="Lora" w:hAnsi="Lora"/>
-                <w:sz w:val="20"/>
-                <w:szCs w:val="20"/>
-              </w:rPr>
-            </w:pPr>
+              <w:spacing w:line="276" w:lineRule="auto"/>
+              <w:rPr>
+                <w:rFonts w:ascii="Lora" w:hAnsi="Lora"/>
+                <w:sz w:val="16"/>
+                <w:szCs w:val="16"/>
+              </w:rPr>
+            </w:pPr>
+            <w:r>
+              <w:rPr>
+                <w:rFonts w:ascii="Lora" w:hAnsi="Lora"/>
+                <w:sz w:val="16"/>
+                <w:szCs w:val="16"/>
+              </w:rPr>
+              <w:t>If a user parks longer, the fee should stay the same or increase — it should never become cheaper for more time.</w:t>
+            </w:r>
           </w:p>
         </w:tc>
       </w:tr>
@@ -4571,6 +5376,7 @@
         <w:tc>
           <w:tcPr>
             <w:tcW w:w="421" w:type="dxa"/>
+            <w:shd w:val="clear" w:color="auto" w:fill="FBE4D5" w:themeFill="accent2" w:themeFillTint="33"/>
             <w:vAlign w:val="center"/>
           </w:tcPr>
           <w:p>
@@ -4592,6 +5398,7 @@
                 <w:sz w:val="20"/>
                 <w:szCs w:val="20"/>
               </w:rPr>
+              <w:lastRenderedPageBreak/>
               <w:t>5</w:t>
             </w:r>
           </w:p>
@@ -4603,12 +5410,21 @@
           </w:tcPr>
           <w:p>
             <w:pPr>
-              <w:rPr>
-                <w:rFonts w:ascii="Lora" w:hAnsi="Lora"/>
-                <w:sz w:val="20"/>
-                <w:szCs w:val="20"/>
-              </w:rPr>
-            </w:pPr>
+              <w:spacing w:line="276" w:lineRule="auto"/>
+              <w:rPr>
+                <w:rFonts w:ascii="Lora" w:hAnsi="Lora"/>
+                <w:sz w:val="16"/>
+                <w:szCs w:val="16"/>
+              </w:rPr>
+            </w:pPr>
+            <w:r>
+              <w:rPr>
+                <w:rFonts w:ascii="Lora" w:hAnsi="Lora"/>
+                <w:sz w:val="16"/>
+                <w:szCs w:val="16"/>
+              </w:rPr>
+              <w:t>Lost ticket fee is always higher or equal to normal fee</w:t>
+            </w:r>
           </w:p>
         </w:tc>
         <w:tc>
@@ -4618,12 +5434,21 @@
           </w:tcPr>
           <w:p>
             <w:pPr>
-              <w:rPr>
-                <w:rFonts w:ascii="Lora" w:hAnsi="Lora"/>
-                <w:sz w:val="20"/>
-                <w:szCs w:val="20"/>
-              </w:rPr>
-            </w:pPr>
+              <w:spacing w:line="276" w:lineRule="auto"/>
+              <w:rPr>
+                <w:rFonts w:ascii="Lora" w:hAnsi="Lora"/>
+                <w:sz w:val="16"/>
+                <w:szCs w:val="16"/>
+              </w:rPr>
+            </w:pPr>
+            <w:r>
+              <w:rPr>
+                <w:rFonts w:ascii="Lora" w:hAnsi="Lora"/>
+                <w:sz w:val="16"/>
+                <w:szCs w:val="16"/>
+              </w:rPr>
+              <w:t>If a ticket is lost, the system adds a penalty, so the final fee must always be greater than or equal to the normal calculated fee.</w:t>
+            </w:r>
           </w:p>
         </w:tc>
       </w:tr>
@@ -4693,7 +5518,6 @@
           <w:rFonts w:ascii="Lora" w:hAnsi="Lora"/>
           <w:szCs w:val="22"/>
         </w:rPr>
-        <w:lastRenderedPageBreak/>
         <w:t xml:space="preserve">List your TDD commits in order. Each row = one commit. This must match your actual git history. You need at least 8 commits showing the RED </w:t>
       </w:r>
       <w:r>
@@ -4775,6 +5599,7 @@
         <w:tc>
           <w:tcPr>
             <w:tcW w:w="421" w:type="dxa"/>
+            <w:shd w:val="clear" w:color="auto" w:fill="D0CECE" w:themeFill="background2" w:themeFillShade="E6"/>
             <w:vAlign w:val="center"/>
           </w:tcPr>
           <w:p>
@@ -4803,6 +5628,7 @@
         <w:tc>
           <w:tcPr>
             <w:tcW w:w="2551" w:type="dxa"/>
+            <w:shd w:val="clear" w:color="auto" w:fill="D0CECE" w:themeFill="background2" w:themeFillShade="E6"/>
             <w:vAlign w:val="center"/>
           </w:tcPr>
           <w:p>
@@ -4830,6 +5656,7 @@
         <w:tc>
           <w:tcPr>
             <w:tcW w:w="3402" w:type="dxa"/>
+            <w:shd w:val="clear" w:color="auto" w:fill="D0CECE" w:themeFill="background2" w:themeFillShade="E6"/>
             <w:vAlign w:val="center"/>
           </w:tcPr>
           <w:p>
@@ -4857,6 +5684,7 @@
         <w:tc>
           <w:tcPr>
             <w:tcW w:w="2976" w:type="dxa"/>
+            <w:shd w:val="clear" w:color="auto" w:fill="D0CECE" w:themeFill="background2" w:themeFillShade="E6"/>
             <w:vAlign w:val="center"/>
           </w:tcPr>
           <w:p>
@@ -4889,6 +5717,7 @@
         <w:tc>
           <w:tcPr>
             <w:tcW w:w="421" w:type="dxa"/>
+            <w:shd w:val="clear" w:color="auto" w:fill="D0CECE" w:themeFill="background2" w:themeFillShade="E6"/>
             <w:vAlign w:val="center"/>
           </w:tcPr>
           <w:p>
@@ -4991,6 +5820,7 @@
         <w:tc>
           <w:tcPr>
             <w:tcW w:w="421" w:type="dxa"/>
+            <w:shd w:val="clear" w:color="auto" w:fill="D0CECE" w:themeFill="background2" w:themeFillShade="E6"/>
             <w:vAlign w:val="center"/>
           </w:tcPr>
           <w:p>
@@ -5069,6 +5899,7 @@
         <w:tc>
           <w:tcPr>
             <w:tcW w:w="421" w:type="dxa"/>
+            <w:shd w:val="clear" w:color="auto" w:fill="D0CECE" w:themeFill="background2" w:themeFillShade="E6"/>
             <w:vAlign w:val="center"/>
           </w:tcPr>
           <w:p>
@@ -5147,6 +5978,7 @@
         <w:tc>
           <w:tcPr>
             <w:tcW w:w="421" w:type="dxa"/>
+            <w:shd w:val="clear" w:color="auto" w:fill="D0CECE" w:themeFill="background2" w:themeFillShade="E6"/>
             <w:vAlign w:val="center"/>
           </w:tcPr>
           <w:p>
@@ -5684,6 +6516,17 @@
       </w:tblBorders>
     </w:tblPr>
   </w:style>
+  <w:style w:type="character" w:styleId="Strong">
+    <w:name w:val="Strong"/>
+    <w:basedOn w:val="DefaultParagraphFont"/>
+    <w:uiPriority w:val="22"/>
+    <w:qFormat/>
+    <w:rsid w:val="005D54C6"/>
+    <w:rPr>
+      <w:b/>
+      <w:bCs/>
+    </w:rPr>
+  </w:style>
 </w:styles>
 </file>
 

</xml_diff>